<commit_message>
add cv, riss talk
</commit_message>
<xml_diff>
--- a/assets/pdf/cv_dec25.docx
+++ b/assets/pdf/cv_dec25.docx
@@ -819,7 +819,27 @@
           <w:sz w:val="24"/>
           <w:szCs w:val="24"/>
         </w:rPr>
-        <w:t xml:space="preserve">, D. Prinster, C. Fannjiang, G. Scalia, A. Regev, H. Wang. </w:t>
+        <w:t xml:space="preserve">, D. Prinster, C. </w:t>
+      </w:r>
+      <w:proofErr w:type="spellStart"/>
+      <w:r>
+        <w:rPr>
+          <w:rFonts w:ascii="Times New Roman" w:hAnsi="Times New Roman" w:cs="Times New Roman"/>
+          <w:bCs/>
+          <w:sz w:val="24"/>
+          <w:szCs w:val="24"/>
+        </w:rPr>
+        <w:t>Fannjiang</w:t>
+      </w:r>
+      <w:proofErr w:type="spellEnd"/>
+      <w:r>
+        <w:rPr>
+          <w:rFonts w:ascii="Times New Roman" w:hAnsi="Times New Roman" w:cs="Times New Roman"/>
+          <w:bCs/>
+          <w:sz w:val="24"/>
+          <w:szCs w:val="24"/>
+        </w:rPr>
+        <w:t xml:space="preserve">, G. Scalia, A. Regev, H. Wang. </w:t>
       </w:r>
       <w:r>
         <w:rPr>
@@ -905,26 +925,38 @@
         </w:rPr>
         <w:t>Preprint (</w:t>
       </w:r>
-      <w:hyperlink r:id="rId9" w:history="1">
-        <w:r>
-          <w:rPr>
-            <w:rStyle w:val="Hyperlink"/>
-            <w:rFonts w:ascii="Times New Roman" w:hAnsi="Times New Roman" w:cs="Times New Roman"/>
-            <w:bCs/>
-            <w:sz w:val="24"/>
-            <w:szCs w:val="24"/>
-          </w:rPr>
-          <w:t>arxiv</w:t>
-        </w:r>
-      </w:hyperlink>
-      <w:r>
-        <w:rPr>
-          <w:rFonts w:ascii="Times New Roman" w:hAnsi="Times New Roman" w:cs="Times New Roman"/>
-          <w:bCs/>
-          <w:sz w:val="24"/>
-          <w:szCs w:val="24"/>
-        </w:rPr>
-        <w:t xml:space="preserve">) </w:t>
+      <w:proofErr w:type="spellStart"/>
+      <w:r>
+        <w:fldChar w:fldCharType="begin"/>
+      </w:r>
+      <w:r>
+        <w:instrText>HYPERLINK "https://arxiv.org/abs/2512.03109"</w:instrText>
+      </w:r>
+      <w:r>
+        <w:fldChar w:fldCharType="separate"/>
+      </w:r>
+      <w:r>
+        <w:rPr>
+          <w:rStyle w:val="Hyperlink"/>
+          <w:rFonts w:ascii="Times New Roman" w:hAnsi="Times New Roman" w:cs="Times New Roman"/>
+          <w:bCs/>
+          <w:sz w:val="24"/>
+          <w:szCs w:val="24"/>
+        </w:rPr>
+        <w:t>arxiv</w:t>
+      </w:r>
+      <w:proofErr w:type="spellEnd"/>
+      <w:r>
+        <w:fldChar w:fldCharType="end"/>
+      </w:r>
+      <w:r>
+        <w:rPr>
+          <w:rFonts w:ascii="Times New Roman" w:hAnsi="Times New Roman" w:cs="Times New Roman"/>
+          <w:bCs/>
+          <w:sz w:val="24"/>
+          <w:szCs w:val="24"/>
+        </w:rPr>
+        <w:t>)</w:t>
       </w:r>
     </w:p>
     <w:p>
@@ -1121,7 +1153,27 @@
           <w:sz w:val="24"/>
           <w:szCs w:val="24"/>
         </w:rPr>
-        <w:t>. NeurIPS 2025</w:t>
+        <w:t xml:space="preserve">. </w:t>
+      </w:r>
+      <w:proofErr w:type="spellStart"/>
+      <w:r>
+        <w:rPr>
+          <w:rFonts w:ascii="Times New Roman" w:hAnsi="Times New Roman" w:cs="Times New Roman"/>
+          <w:bCs/>
+          <w:sz w:val="24"/>
+          <w:szCs w:val="24"/>
+        </w:rPr>
+        <w:t>NeurIPS</w:t>
+      </w:r>
+      <w:proofErr w:type="spellEnd"/>
+      <w:r>
+        <w:rPr>
+          <w:rFonts w:ascii="Times New Roman" w:hAnsi="Times New Roman" w:cs="Times New Roman"/>
+          <w:bCs/>
+          <w:sz w:val="24"/>
+          <w:szCs w:val="24"/>
+        </w:rPr>
+        <w:t xml:space="preserve"> 2025</w:t>
       </w:r>
     </w:p>
     <w:p>
@@ -1326,7 +1378,27 @@
           <w:sz w:val="24"/>
           <w:szCs w:val="24"/>
         </w:rPr>
-        <w:t xml:space="preserve">H. Cho, D. Froelicher*, N. Dokmai*, A. Nandi*, </w:t>
+        <w:t xml:space="preserve">H. Cho, D. Froelicher*, N. </w:t>
+      </w:r>
+      <w:proofErr w:type="spellStart"/>
+      <w:r>
+        <w:rPr>
+          <w:rFonts w:ascii="Times New Roman" w:hAnsi="Times New Roman" w:cs="Times New Roman"/>
+          <w:bCs/>
+          <w:sz w:val="24"/>
+          <w:szCs w:val="24"/>
+        </w:rPr>
+        <w:t>Dokmai</w:t>
+      </w:r>
+      <w:proofErr w:type="spellEnd"/>
+      <w:r>
+        <w:rPr>
+          <w:rFonts w:ascii="Times New Roman" w:hAnsi="Times New Roman" w:cs="Times New Roman"/>
+          <w:bCs/>
+          <w:sz w:val="24"/>
+          <w:szCs w:val="24"/>
+        </w:rPr>
+        <w:t xml:space="preserve">*, A. Nandi*, </w:t>
       </w:r>
       <w:r>
         <w:rPr>
@@ -1642,6 +1714,7 @@
         </w:rPr>
         <w:t xml:space="preserve">Topological </w:t>
       </w:r>
+      <w:proofErr w:type="spellStart"/>
       <w:r>
         <w:rPr>
           <w:rFonts w:ascii="Times New Roman" w:hAnsi="Times New Roman" w:cs="Times New Roman"/>
@@ -1662,7 +1735,19 @@
           <w:sz w:val="24"/>
           <w:szCs w:val="24"/>
         </w:rPr>
-        <w:t xml:space="preserve">hononic </w:t>
+        <w:t>hononic</w:t>
+      </w:r>
+      <w:proofErr w:type="spellEnd"/>
+      <w:r>
+        <w:rPr>
+          <w:rFonts w:ascii="Times New Roman" w:hAnsi="Times New Roman" w:cs="Times New Roman"/>
+          <w:bCs/>
+          <w:i/>
+          <w:iCs/>
+          <w:sz w:val="24"/>
+          <w:szCs w:val="24"/>
+        </w:rPr>
+        <w:t xml:space="preserve"> </w:t>
       </w:r>
       <w:r>
         <w:rPr>
@@ -1772,7 +1857,7 @@
         </w:rPr>
         <w:t xml:space="preserve">Press: </w:t>
       </w:r>
-      <w:hyperlink r:id="rId10" w:history="1">
+      <w:hyperlink r:id="rId9" w:history="1">
         <w:r>
           <w:rPr>
             <w:rStyle w:val="Hyperlink"/>
@@ -1797,7 +1882,7 @@
         </w:rPr>
         <w:t xml:space="preserve">, </w:t>
       </w:r>
-      <w:hyperlink r:id="rId11" w:history="1">
+      <w:hyperlink r:id="rId10" w:history="1">
         <w:r>
           <w:rPr>
             <w:rStyle w:val="Hyperlink"/>
@@ -1822,7 +1907,7 @@
         </w:rPr>
         <w:t xml:space="preserve">, </w:t>
       </w:r>
-      <w:hyperlink r:id="rId12" w:history="1">
+      <w:hyperlink r:id="rId11" w:history="1">
         <w:r>
           <w:rPr>
             <w:rStyle w:val="Hyperlink"/>
@@ -1847,7 +1932,8 @@
         </w:rPr>
         <w:t xml:space="preserve">, </w:t>
       </w:r>
-      <w:hyperlink r:id="rId13" w:history="1">
+      <w:hyperlink r:id="rId12" w:history="1">
+        <w:proofErr w:type="spellStart"/>
         <w:r>
           <w:rPr>
             <w:rStyle w:val="Hyperlink"/>
@@ -1860,6 +1946,7 @@
           </w:rPr>
           <w:t>Hackaday</w:t>
         </w:r>
+        <w:proofErr w:type="spellEnd"/>
       </w:hyperlink>
     </w:p>
     <w:p>
@@ -1905,7 +1992,27 @@
           <w:sz w:val="24"/>
           <w:szCs w:val="24"/>
         </w:rPr>
-        <w:t xml:space="preserve">Q. Wang, D. Kelley, J. Ulrisch, M. Kanai, </w:t>
+        <w:t xml:space="preserve">Q. Wang, D. Kelley, J. </w:t>
+      </w:r>
+      <w:proofErr w:type="spellStart"/>
+      <w:r>
+        <w:rPr>
+          <w:rFonts w:ascii="Times New Roman" w:hAnsi="Times New Roman" w:cs="Times New Roman"/>
+          <w:bCs/>
+          <w:sz w:val="24"/>
+          <w:szCs w:val="24"/>
+        </w:rPr>
+        <w:t>Ulrisch</w:t>
+      </w:r>
+      <w:proofErr w:type="spellEnd"/>
+      <w:r>
+        <w:rPr>
+          <w:rFonts w:ascii="Times New Roman" w:hAnsi="Times New Roman" w:cs="Times New Roman"/>
+          <w:bCs/>
+          <w:sz w:val="24"/>
+          <w:szCs w:val="24"/>
+        </w:rPr>
+        <w:t xml:space="preserve">, M. Kanai, </w:t>
       </w:r>
       <w:r>
         <w:rPr>
@@ -1924,7 +2031,67 @@
           <w:sz w:val="24"/>
           <w:szCs w:val="24"/>
         </w:rPr>
-        <w:t xml:space="preserve">, R. Cui, C. Albors, N. Cheng, Y. Okada, Biobank Japan Project, F. Aguet, K. Ardlie, D. MacArthur, H. Finucane. </w:t>
+        <w:t xml:space="preserve">, R. Cui, C. </w:t>
+      </w:r>
+      <w:proofErr w:type="spellStart"/>
+      <w:r>
+        <w:rPr>
+          <w:rFonts w:ascii="Times New Roman" w:hAnsi="Times New Roman" w:cs="Times New Roman"/>
+          <w:bCs/>
+          <w:sz w:val="24"/>
+          <w:szCs w:val="24"/>
+        </w:rPr>
+        <w:t>Albors</w:t>
+      </w:r>
+      <w:proofErr w:type="spellEnd"/>
+      <w:r>
+        <w:rPr>
+          <w:rFonts w:ascii="Times New Roman" w:hAnsi="Times New Roman" w:cs="Times New Roman"/>
+          <w:bCs/>
+          <w:sz w:val="24"/>
+          <w:szCs w:val="24"/>
+        </w:rPr>
+        <w:t xml:space="preserve">, N. Cheng, Y. Okada, Biobank Japan Project, F. </w:t>
+      </w:r>
+      <w:proofErr w:type="spellStart"/>
+      <w:r>
+        <w:rPr>
+          <w:rFonts w:ascii="Times New Roman" w:hAnsi="Times New Roman" w:cs="Times New Roman"/>
+          <w:bCs/>
+          <w:sz w:val="24"/>
+          <w:szCs w:val="24"/>
+        </w:rPr>
+        <w:t>Aguet</w:t>
+      </w:r>
+      <w:proofErr w:type="spellEnd"/>
+      <w:r>
+        <w:rPr>
+          <w:rFonts w:ascii="Times New Roman" w:hAnsi="Times New Roman" w:cs="Times New Roman"/>
+          <w:bCs/>
+          <w:sz w:val="24"/>
+          <w:szCs w:val="24"/>
+        </w:rPr>
+        <w:t xml:space="preserve">, K. </w:t>
+      </w:r>
+      <w:proofErr w:type="spellStart"/>
+      <w:r>
+        <w:rPr>
+          <w:rFonts w:ascii="Times New Roman" w:hAnsi="Times New Roman" w:cs="Times New Roman"/>
+          <w:bCs/>
+          <w:sz w:val="24"/>
+          <w:szCs w:val="24"/>
+        </w:rPr>
+        <w:t>Ardlie</w:t>
+      </w:r>
+      <w:proofErr w:type="spellEnd"/>
+      <w:r>
+        <w:rPr>
+          <w:rFonts w:ascii="Times New Roman" w:hAnsi="Times New Roman" w:cs="Times New Roman"/>
+          <w:bCs/>
+          <w:sz w:val="24"/>
+          <w:szCs w:val="24"/>
+        </w:rPr>
+        <w:t xml:space="preserve">, D. MacArthur, H. Finucane. </w:t>
       </w:r>
       <w:r>
         <w:rPr>
@@ -1935,7 +2102,55 @@
           <w:sz w:val="24"/>
           <w:szCs w:val="24"/>
         </w:rPr>
-        <w:t>Leveraging supervised learning for functionally informed fine-mapping of cis-eQTLs identifies an additional 20,913 putative causal eQTLs. Nature Communications</w:t>
+        <w:t>Leveraging supervised learning for functionally informed fine-mapping of cis-</w:t>
+      </w:r>
+      <w:proofErr w:type="spellStart"/>
+      <w:r>
+        <w:rPr>
+          <w:rFonts w:ascii="Times New Roman" w:hAnsi="Times New Roman" w:cs="Times New Roman"/>
+          <w:bCs/>
+          <w:i/>
+          <w:iCs/>
+          <w:sz w:val="24"/>
+          <w:szCs w:val="24"/>
+        </w:rPr>
+        <w:t>eQTLs</w:t>
+      </w:r>
+      <w:proofErr w:type="spellEnd"/>
+      <w:r>
+        <w:rPr>
+          <w:rFonts w:ascii="Times New Roman" w:hAnsi="Times New Roman" w:cs="Times New Roman"/>
+          <w:bCs/>
+          <w:i/>
+          <w:iCs/>
+          <w:sz w:val="24"/>
+          <w:szCs w:val="24"/>
+        </w:rPr>
+        <w:t xml:space="preserve"> identifies an additional 20,913 putative causal </w:t>
+      </w:r>
+      <w:proofErr w:type="spellStart"/>
+      <w:r>
+        <w:rPr>
+          <w:rFonts w:ascii="Times New Roman" w:hAnsi="Times New Roman" w:cs="Times New Roman"/>
+          <w:bCs/>
+          <w:i/>
+          <w:iCs/>
+          <w:sz w:val="24"/>
+          <w:szCs w:val="24"/>
+        </w:rPr>
+        <w:t>eQTLs</w:t>
+      </w:r>
+      <w:proofErr w:type="spellEnd"/>
+      <w:r>
+        <w:rPr>
+          <w:rFonts w:ascii="Times New Roman" w:hAnsi="Times New Roman" w:cs="Times New Roman"/>
+          <w:bCs/>
+          <w:i/>
+          <w:iCs/>
+          <w:sz w:val="24"/>
+          <w:szCs w:val="24"/>
+        </w:rPr>
+        <w:t>. Nature Communications</w:t>
       </w:r>
       <w:r>
         <w:rPr>
@@ -2133,9 +2348,385 @@
         <w:pBdr>
           <w:bottom w:val="single" w:sz="4" w:space="1" w:color="auto"/>
         </w:pBdr>
+        <w:spacing w:after="60"/>
+        <w:rPr>
+          <w:rFonts w:ascii="Times New Roman" w:hAnsi="Times New Roman" w:cs="Times New Roman"/>
+          <w:b/>
+          <w:sz w:val="24"/>
+          <w:szCs w:val="24"/>
+        </w:rPr>
+      </w:pPr>
+    </w:p>
+    <w:p>
+      <w:pPr>
+        <w:pBdr>
+          <w:bottom w:val="single" w:sz="4" w:space="1" w:color="auto"/>
+        </w:pBdr>
+        <w:spacing w:after="60"/>
+        <w:rPr>
+          <w:rFonts w:ascii="Times New Roman" w:hAnsi="Times New Roman" w:cs="Times New Roman"/>
+          <w:b/>
+          <w:sz w:val="24"/>
+          <w:szCs w:val="24"/>
+        </w:rPr>
+      </w:pPr>
+      <w:r>
+        <w:rPr>
+          <w:rFonts w:ascii="Times New Roman" w:hAnsi="Times New Roman" w:cs="Times New Roman"/>
+          <w:b/>
+          <w:sz w:val="24"/>
+          <w:szCs w:val="24"/>
+        </w:rPr>
+        <w:t>TALKS</w:t>
+      </w:r>
+      <w:r>
+        <w:rPr>
+          <w:rFonts w:ascii="Times New Roman" w:hAnsi="Times New Roman" w:cs="Times New Roman"/>
+          <w:b/>
+          <w:sz w:val="24"/>
+          <w:szCs w:val="24"/>
+        </w:rPr>
+        <w:t xml:space="preserve"> &amp; PRESENTATIONS</w:t>
+      </w:r>
+    </w:p>
+    <w:p>
+      <w:pPr>
         <w:tabs>
           <w:tab w:val="right" w:pos="9360"/>
         </w:tabs>
+        <w:autoSpaceDE w:val="0"/>
+        <w:autoSpaceDN w:val="0"/>
+        <w:adjustRightInd w:val="0"/>
+        <w:spacing w:after="0" w:line="240" w:lineRule="auto"/>
+        <w:rPr>
+          <w:rFonts w:ascii="Times New Roman" w:hAnsi="Times New Roman" w:cs="Times New Roman"/>
+          <w:b/>
+          <w:bCs/>
+          <w:sz w:val="24"/>
+          <w:szCs w:val="24"/>
+        </w:rPr>
+      </w:pPr>
+      <w:r>
+        <w:rPr>
+          <w:rFonts w:ascii="Times New Roman" w:hAnsi="Times New Roman" w:cs="Times New Roman"/>
+          <w:b/>
+          <w:bCs/>
+          <w:sz w:val="24"/>
+          <w:szCs w:val="24"/>
+        </w:rPr>
+        <w:t>E-valuator: Reliable Agent Verifiers with Sequential Hypothesis Testing</w:t>
+      </w:r>
+    </w:p>
+    <w:p>
+      <w:pPr>
+        <w:tabs>
+          <w:tab w:val="right" w:pos="9360"/>
+        </w:tabs>
+        <w:autoSpaceDE w:val="0"/>
+        <w:autoSpaceDN w:val="0"/>
+        <w:adjustRightInd w:val="0"/>
+        <w:spacing w:after="0" w:line="240" w:lineRule="auto"/>
+        <w:rPr>
+          <w:rFonts w:ascii="Times New Roman" w:hAnsi="Times New Roman" w:cs="Times New Roman"/>
+          <w:sz w:val="24"/>
+          <w:szCs w:val="24"/>
+        </w:rPr>
+      </w:pPr>
+      <w:r>
+        <w:rPr>
+          <w:rFonts w:ascii="Times New Roman" w:hAnsi="Times New Roman" w:cs="Times New Roman"/>
+          <w:sz w:val="24"/>
+          <w:szCs w:val="24"/>
+        </w:rPr>
+        <w:t>Rational Intelligence Seminar Series</w:t>
+      </w:r>
+      <w:r>
+        <w:rPr>
+          <w:rFonts w:ascii="Times New Roman" w:hAnsi="Times New Roman" w:cs="Times New Roman"/>
+          <w:sz w:val="24"/>
+          <w:szCs w:val="24"/>
+        </w:rPr>
+        <w:t xml:space="preserve"> [</w:t>
+      </w:r>
+      <w:hyperlink r:id="rId13" w:history="1">
+        <w:r>
+          <w:rPr>
+            <w:rStyle w:val="Hyperlink"/>
+            <w:rFonts w:ascii="Times New Roman" w:hAnsi="Times New Roman" w:cs="Times New Roman"/>
+            <w:sz w:val="24"/>
+            <w:szCs w:val="24"/>
+          </w:rPr>
+          <w:t>YouTube</w:t>
+        </w:r>
+      </w:hyperlink>
+      <w:r>
+        <w:rPr>
+          <w:rFonts w:ascii="Times New Roman" w:hAnsi="Times New Roman" w:cs="Times New Roman"/>
+          <w:sz w:val="24"/>
+          <w:szCs w:val="24"/>
+        </w:rPr>
+        <w:t>]</w:t>
+      </w:r>
+      <w:r>
+        <w:rPr>
+          <w:rFonts w:ascii="Times New Roman" w:hAnsi="Times New Roman" w:cs="Times New Roman"/>
+          <w:sz w:val="24"/>
+          <w:szCs w:val="24"/>
+        </w:rPr>
+        <w:tab/>
+      </w:r>
+      <w:r>
+        <w:rPr>
+          <w:rFonts w:ascii="Times New Roman" w:hAnsi="Times New Roman" w:cs="Times New Roman"/>
+          <w:sz w:val="24"/>
+          <w:szCs w:val="24"/>
+        </w:rPr>
+        <w:t>2026</w:t>
+      </w:r>
+    </w:p>
+    <w:p>
+      <w:pPr>
+        <w:tabs>
+          <w:tab w:val="right" w:pos="9360"/>
+        </w:tabs>
+        <w:autoSpaceDE w:val="0"/>
+        <w:autoSpaceDN w:val="0"/>
+        <w:adjustRightInd w:val="0"/>
+        <w:spacing w:after="0" w:line="240" w:lineRule="auto"/>
+        <w:rPr>
+          <w:rFonts w:ascii="Times New Roman" w:hAnsi="Times New Roman" w:cs="Times New Roman"/>
+          <w:sz w:val="24"/>
+          <w:szCs w:val="24"/>
+        </w:rPr>
+      </w:pPr>
+      <w:r>
+        <w:rPr>
+          <w:rFonts w:ascii="Times New Roman" w:hAnsi="Times New Roman" w:cs="Times New Roman"/>
+          <w:sz w:val="24"/>
+          <w:szCs w:val="24"/>
+        </w:rPr>
+        <w:t xml:space="preserve">MIT, Algorithms Coffee                                                                                                           </w:t>
+      </w:r>
+      <w:r>
+        <w:rPr>
+          <w:rFonts w:ascii="Times New Roman" w:hAnsi="Times New Roman" w:cs="Times New Roman"/>
+          <w:sz w:val="24"/>
+          <w:szCs w:val="24"/>
+        </w:rPr>
+        <w:tab/>
+        <w:t>2026</w:t>
+      </w:r>
+    </w:p>
+    <w:p>
+      <w:pPr>
+        <w:tabs>
+          <w:tab w:val="right" w:pos="9360"/>
+        </w:tabs>
+        <w:autoSpaceDE w:val="0"/>
+        <w:autoSpaceDN w:val="0"/>
+        <w:adjustRightInd w:val="0"/>
+        <w:spacing w:after="0" w:line="240" w:lineRule="auto"/>
+        <w:rPr>
+          <w:rFonts w:ascii="Times New Roman" w:hAnsi="Times New Roman" w:cs="Times New Roman"/>
+          <w:sz w:val="24"/>
+          <w:szCs w:val="24"/>
+        </w:rPr>
+      </w:pPr>
+    </w:p>
+    <w:p>
+      <w:pPr>
+        <w:tabs>
+          <w:tab w:val="right" w:pos="9360"/>
+        </w:tabs>
+        <w:autoSpaceDE w:val="0"/>
+        <w:autoSpaceDN w:val="0"/>
+        <w:adjustRightInd w:val="0"/>
+        <w:spacing w:after="0" w:line="240" w:lineRule="auto"/>
+        <w:rPr>
+          <w:rFonts w:ascii="Times New Roman" w:hAnsi="Times New Roman" w:cs="Times New Roman"/>
+          <w:b/>
+          <w:bCs/>
+          <w:sz w:val="24"/>
+          <w:szCs w:val="24"/>
+        </w:rPr>
+      </w:pPr>
+      <w:r>
+        <w:rPr>
+          <w:rFonts w:ascii="Times New Roman" w:hAnsi="Times New Roman" w:cs="Times New Roman"/>
+          <w:b/>
+          <w:bCs/>
+          <w:sz w:val="24"/>
+          <w:szCs w:val="24"/>
+        </w:rPr>
+        <w:t>Evaluating multiple models using labeled and unlabeled data</w:t>
+      </w:r>
+    </w:p>
+    <w:p>
+      <w:pPr>
+        <w:tabs>
+          <w:tab w:val="right" w:pos="9360"/>
+        </w:tabs>
+        <w:autoSpaceDE w:val="0"/>
+        <w:autoSpaceDN w:val="0"/>
+        <w:adjustRightInd w:val="0"/>
+        <w:spacing w:after="0" w:line="240" w:lineRule="auto"/>
+        <w:rPr>
+          <w:rFonts w:ascii="Times New Roman" w:hAnsi="Times New Roman" w:cs="Times New Roman"/>
+          <w:sz w:val="24"/>
+          <w:szCs w:val="24"/>
+        </w:rPr>
+      </w:pPr>
+      <w:r>
+        <w:rPr>
+          <w:rFonts w:ascii="Times New Roman" w:hAnsi="Times New Roman" w:cs="Times New Roman"/>
+          <w:sz w:val="24"/>
+          <w:szCs w:val="24"/>
+        </w:rPr>
+        <w:t>MIT, Machine Learning Tea</w:t>
+      </w:r>
+      <w:r>
+        <w:rPr>
+          <w:rFonts w:ascii="Times New Roman" w:hAnsi="Times New Roman" w:cs="Times New Roman"/>
+          <w:sz w:val="24"/>
+          <w:szCs w:val="24"/>
+        </w:rPr>
+        <w:tab/>
+        <w:t>2025</w:t>
+      </w:r>
+    </w:p>
+    <w:p>
+      <w:pPr>
+        <w:tabs>
+          <w:tab w:val="right" w:pos="9360"/>
+        </w:tabs>
+        <w:autoSpaceDE w:val="0"/>
+        <w:autoSpaceDN w:val="0"/>
+        <w:adjustRightInd w:val="0"/>
+        <w:spacing w:after="0" w:line="240" w:lineRule="auto"/>
+        <w:rPr>
+          <w:rFonts w:ascii="Times New Roman" w:hAnsi="Times New Roman" w:cs="Times New Roman"/>
+          <w:sz w:val="24"/>
+          <w:szCs w:val="24"/>
+        </w:rPr>
+      </w:pPr>
+    </w:p>
+    <w:p>
+      <w:pPr>
+        <w:tabs>
+          <w:tab w:val="right" w:pos="9360"/>
+        </w:tabs>
+        <w:autoSpaceDE w:val="0"/>
+        <w:autoSpaceDN w:val="0"/>
+        <w:adjustRightInd w:val="0"/>
+        <w:spacing w:after="0" w:line="240" w:lineRule="auto"/>
+        <w:rPr>
+          <w:rFonts w:ascii="Times New Roman" w:hAnsi="Times New Roman" w:cs="Times New Roman"/>
+          <w:sz w:val="24"/>
+          <w:szCs w:val="24"/>
+        </w:rPr>
+      </w:pPr>
+      <w:r>
+        <w:rPr>
+          <w:rFonts w:ascii="Times New Roman" w:hAnsi="Times New Roman" w:cs="Times New Roman"/>
+          <w:b/>
+          <w:bCs/>
+          <w:sz w:val="24"/>
+          <w:szCs w:val="24"/>
+        </w:rPr>
+        <w:t>Assessing transcriptomic reidentification risks</w:t>
+      </w:r>
+      <w:r>
+        <w:rPr>
+          <w:rFonts w:ascii="Times New Roman" w:hAnsi="Times New Roman" w:cs="Times New Roman"/>
+          <w:b/>
+          <w:bCs/>
+          <w:sz w:val="24"/>
+          <w:szCs w:val="24"/>
+        </w:rPr>
+        <w:tab/>
+      </w:r>
+    </w:p>
+    <w:p>
+      <w:pPr>
+        <w:tabs>
+          <w:tab w:val="right" w:pos="9360"/>
+        </w:tabs>
+        <w:autoSpaceDE w:val="0"/>
+        <w:autoSpaceDN w:val="0"/>
+        <w:adjustRightInd w:val="0"/>
+        <w:spacing w:after="0" w:line="240" w:lineRule="auto"/>
+        <w:rPr>
+          <w:rFonts w:ascii="Times New Roman" w:hAnsi="Times New Roman" w:cs="Times New Roman"/>
+          <w:sz w:val="24"/>
+          <w:szCs w:val="24"/>
+        </w:rPr>
+      </w:pPr>
+      <w:r>
+        <w:rPr>
+          <w:rFonts w:ascii="Times New Roman" w:hAnsi="Times New Roman" w:cs="Times New Roman"/>
+          <w:sz w:val="24"/>
+          <w:szCs w:val="24"/>
+        </w:rPr>
+        <w:t>RECOMB</w:t>
+      </w:r>
+      <w:r>
+        <w:rPr>
+          <w:rFonts w:ascii="Times New Roman" w:hAnsi="Times New Roman" w:cs="Times New Roman"/>
+          <w:sz w:val="24"/>
+          <w:szCs w:val="24"/>
+        </w:rPr>
+        <w:t>, Oral Presentation</w:t>
+      </w:r>
+      <w:r>
+        <w:rPr>
+          <w:rFonts w:ascii="Times New Roman" w:hAnsi="Times New Roman" w:cs="Times New Roman"/>
+          <w:sz w:val="24"/>
+          <w:szCs w:val="24"/>
+        </w:rPr>
+        <w:t xml:space="preserve"> [</w:t>
+      </w:r>
+      <w:hyperlink r:id="rId14" w:history="1">
+        <w:r>
+          <w:rPr>
+            <w:rStyle w:val="Hyperlink"/>
+            <w:rFonts w:ascii="Times New Roman" w:hAnsi="Times New Roman" w:cs="Times New Roman"/>
+            <w:sz w:val="24"/>
+            <w:szCs w:val="24"/>
+          </w:rPr>
+          <w:t>YouTube</w:t>
+        </w:r>
+      </w:hyperlink>
+      <w:r>
+        <w:rPr>
+          <w:rFonts w:ascii="Times New Roman" w:hAnsi="Times New Roman" w:cs="Times New Roman"/>
+          <w:sz w:val="24"/>
+          <w:szCs w:val="24"/>
+        </w:rPr>
+        <w:t>]</w:t>
+      </w:r>
+      <w:r>
+        <w:rPr>
+          <w:rFonts w:ascii="Times New Roman" w:hAnsi="Times New Roman" w:cs="Times New Roman"/>
+          <w:sz w:val="24"/>
+          <w:szCs w:val="24"/>
+        </w:rPr>
+        <w:tab/>
+        <w:t>202</w:t>
+      </w:r>
+      <w:r>
+        <w:rPr>
+          <w:rFonts w:ascii="Times New Roman" w:hAnsi="Times New Roman" w:cs="Times New Roman"/>
+          <w:sz w:val="24"/>
+          <w:szCs w:val="24"/>
+        </w:rPr>
+        <w:t>4</w:t>
+      </w:r>
+    </w:p>
+    <w:p>
+      <w:pPr>
+        <w:pBdr>
+          <w:bottom w:val="single" w:sz="4" w:space="1" w:color="auto"/>
+        </w:pBdr>
         <w:spacing w:after="60"/>
         <w:rPr>
           <w:rFonts w:ascii="Times New Roman" w:hAnsi="Times New Roman" w:cs="Times New Roman"/>
@@ -2456,7 +3047,25 @@
           <w:sz w:val="24"/>
           <w:szCs w:val="24"/>
         </w:rPr>
-        <w:t>(Prof. Michael Mitzenmacher)</w:t>
+        <w:t xml:space="preserve">(Prof. Michael </w:t>
+      </w:r>
+      <w:proofErr w:type="spellStart"/>
+      <w:r>
+        <w:rPr>
+          <w:rFonts w:ascii="Times New Roman" w:hAnsi="Times New Roman" w:cs="Times New Roman"/>
+          <w:sz w:val="24"/>
+          <w:szCs w:val="24"/>
+        </w:rPr>
+        <w:t>Mitzenmacher</w:t>
+      </w:r>
+      <w:proofErr w:type="spellEnd"/>
+      <w:r>
+        <w:rPr>
+          <w:rFonts w:ascii="Times New Roman" w:hAnsi="Times New Roman" w:cs="Times New Roman"/>
+          <w:sz w:val="24"/>
+          <w:szCs w:val="24"/>
+        </w:rPr>
+        <w:t>)</w:t>
       </w:r>
       <w:r>
         <w:rPr>
@@ -2650,23 +3259,6 @@
         </w:rPr>
         <w:t>Fall 2019</w:t>
       </w:r>
-    </w:p>
-    <w:p>
-      <w:pPr>
-        <w:pBdr>
-          <w:bottom w:val="single" w:sz="4" w:space="1" w:color="auto"/>
-        </w:pBdr>
-        <w:tabs>
-          <w:tab w:val="right" w:pos="9360"/>
-        </w:tabs>
-        <w:spacing w:after="60"/>
-        <w:rPr>
-          <w:rFonts w:ascii="Times New Roman" w:hAnsi="Times New Roman" w:cs="Times New Roman"/>
-          <w:b/>
-          <w:sz w:val="24"/>
-          <w:szCs w:val="24"/>
-        </w:rPr>
-      </w:pPr>
     </w:p>
     <w:p>
       <w:pPr>
@@ -2681,122 +3273,6 @@
           <w:szCs w:val="24"/>
         </w:rPr>
       </w:pPr>
-      <w:r>
-        <w:rPr>
-          <w:rFonts w:ascii="Times New Roman" w:hAnsi="Times New Roman" w:cs="Times New Roman"/>
-          <w:b/>
-          <w:sz w:val="24"/>
-          <w:szCs w:val="24"/>
-        </w:rPr>
-        <w:t>REVIEWING AND SERVICE</w:t>
-      </w:r>
-      <w:r>
-        <w:rPr>
-          <w:rFonts w:ascii="Times New Roman" w:hAnsi="Times New Roman" w:cs="Times New Roman"/>
-          <w:b/>
-          <w:sz w:val="24"/>
-          <w:szCs w:val="24"/>
-        </w:rPr>
-        <w:tab/>
-      </w:r>
-    </w:p>
-    <w:p>
-      <w:pPr>
-        <w:tabs>
-          <w:tab w:val="right" w:pos="9360"/>
-        </w:tabs>
-        <w:autoSpaceDE w:val="0"/>
-        <w:autoSpaceDN w:val="0"/>
-        <w:adjustRightInd w:val="0"/>
-        <w:spacing w:after="0" w:line="240" w:lineRule="auto"/>
-        <w:rPr>
-          <w:rFonts w:ascii="Times New Roman" w:hAnsi="Times New Roman" w:cs="Times New Roman"/>
-          <w:sz w:val="24"/>
-          <w:szCs w:val="24"/>
-        </w:rPr>
-      </w:pPr>
-      <w:r>
-        <w:rPr>
-          <w:rFonts w:ascii="Times New Roman" w:hAnsi="Times New Roman" w:cs="Times New Roman"/>
-          <w:sz w:val="24"/>
-          <w:szCs w:val="24"/>
-        </w:rPr>
-        <w:t>Roundtable Chair, ML4H 2024</w:t>
-      </w:r>
-      <w:r>
-        <w:rPr>
-          <w:rFonts w:ascii="Times New Roman" w:hAnsi="Times New Roman" w:cs="Times New Roman"/>
-          <w:sz w:val="24"/>
-          <w:szCs w:val="24"/>
-        </w:rPr>
-        <w:t>, 2025</w:t>
-      </w:r>
-      <w:r>
-        <w:rPr>
-          <w:rFonts w:ascii="Times New Roman" w:hAnsi="Times New Roman" w:cs="Times New Roman"/>
-          <w:sz w:val="24"/>
-          <w:szCs w:val="24"/>
-        </w:rPr>
-        <w:tab/>
-        <w:t>2024</w:t>
-      </w:r>
-      <w:r>
-        <w:rPr>
-          <w:rFonts w:ascii="Times New Roman" w:hAnsi="Times New Roman" w:cs="Times New Roman"/>
-          <w:sz w:val="24"/>
-          <w:szCs w:val="24"/>
-        </w:rPr>
-        <w:t>, 2025</w:t>
-      </w:r>
-    </w:p>
-    <w:p>
-      <w:pPr>
-        <w:tabs>
-          <w:tab w:val="right" w:pos="9360"/>
-        </w:tabs>
-        <w:autoSpaceDE w:val="0"/>
-        <w:autoSpaceDN w:val="0"/>
-        <w:adjustRightInd w:val="0"/>
-        <w:spacing w:after="0" w:line="240" w:lineRule="auto"/>
-        <w:rPr>
-          <w:rFonts w:ascii="Times New Roman" w:hAnsi="Times New Roman" w:cs="Times New Roman"/>
-          <w:sz w:val="24"/>
-          <w:szCs w:val="24"/>
-        </w:rPr>
-      </w:pPr>
-      <w:r>
-        <w:rPr>
-          <w:rFonts w:ascii="Times New Roman" w:hAnsi="Times New Roman" w:cs="Times New Roman"/>
-          <w:sz w:val="24"/>
-          <w:szCs w:val="24"/>
-        </w:rPr>
-        <w:t>Member, NIST AI Safety Institute Task Force on Red Teaming                                              2024</w:t>
-      </w:r>
-    </w:p>
-    <w:p>
-      <w:pPr>
-        <w:tabs>
-          <w:tab w:val="right" w:pos="9360"/>
-        </w:tabs>
-        <w:autoSpaceDE w:val="0"/>
-        <w:autoSpaceDN w:val="0"/>
-        <w:adjustRightInd w:val="0"/>
-        <w:spacing w:after="0" w:line="240" w:lineRule="auto"/>
-        <w:jc w:val="center"/>
-        <w:rPr>
-          <w:rFonts w:ascii="Times New Roman" w:hAnsi="Times New Roman" w:cs="Times New Roman"/>
-          <w:sz w:val="24"/>
-          <w:szCs w:val="24"/>
-        </w:rPr>
-      </w:pPr>
-      <w:r>
-        <w:rPr>
-          <w:rFonts w:ascii="Times New Roman" w:hAnsi="Times New Roman" w:cs="Times New Roman"/>
-          <w:sz w:val="24"/>
-          <w:szCs w:val="24"/>
-        </w:rPr>
-        <w:t>Planning Committee, Hertz Foundation Summer Workshop                                                    2023</w:t>
-      </w:r>
     </w:p>
     <w:p>
       <w:pPr>
@@ -2806,17 +3282,181 @@
         <w:spacing w:after="60"/>
         <w:rPr>
           <w:rFonts w:ascii="Times New Roman" w:hAnsi="Times New Roman" w:cs="Times New Roman"/>
-          <w:sz w:val="24"/>
-          <w:szCs w:val="24"/>
-        </w:rPr>
-      </w:pPr>
-      <w:r>
-        <w:rPr>
-          <w:rFonts w:ascii="Times New Roman" w:hAnsi="Times New Roman" w:cs="Times New Roman"/>
-          <w:sz w:val="24"/>
-          <w:szCs w:val="24"/>
-        </w:rPr>
-        <w:t xml:space="preserve">Reviewing: NeurIPS, ICLR, ICLR MLGenX workshop, Journal of Computational Biology, </w:t>
+          <w:b/>
+          <w:sz w:val="24"/>
+          <w:szCs w:val="24"/>
+        </w:rPr>
+      </w:pPr>
+      <w:r>
+        <w:rPr>
+          <w:rFonts w:ascii="Times New Roman" w:hAnsi="Times New Roman" w:cs="Times New Roman"/>
+          <w:b/>
+          <w:sz w:val="24"/>
+          <w:szCs w:val="24"/>
+        </w:rPr>
+        <w:t>REVIEWING AND SERVICE</w:t>
+      </w:r>
+      <w:r>
+        <w:rPr>
+          <w:rFonts w:ascii="Times New Roman" w:hAnsi="Times New Roman" w:cs="Times New Roman"/>
+          <w:b/>
+          <w:sz w:val="24"/>
+          <w:szCs w:val="24"/>
+        </w:rPr>
+        <w:tab/>
+      </w:r>
+    </w:p>
+    <w:p>
+      <w:pPr>
+        <w:tabs>
+          <w:tab w:val="right" w:pos="9360"/>
+        </w:tabs>
+        <w:autoSpaceDE w:val="0"/>
+        <w:autoSpaceDN w:val="0"/>
+        <w:adjustRightInd w:val="0"/>
+        <w:spacing w:after="0" w:line="240" w:lineRule="auto"/>
+        <w:rPr>
+          <w:rFonts w:ascii="Times New Roman" w:hAnsi="Times New Roman" w:cs="Times New Roman"/>
+          <w:sz w:val="24"/>
+          <w:szCs w:val="24"/>
+        </w:rPr>
+      </w:pPr>
+      <w:r>
+        <w:rPr>
+          <w:rFonts w:ascii="Times New Roman" w:hAnsi="Times New Roman" w:cs="Times New Roman"/>
+          <w:sz w:val="24"/>
+          <w:szCs w:val="24"/>
+        </w:rPr>
+        <w:t>Roundtable Chair, ML4H 2024</w:t>
+      </w:r>
+      <w:r>
+        <w:rPr>
+          <w:rFonts w:ascii="Times New Roman" w:hAnsi="Times New Roman" w:cs="Times New Roman"/>
+          <w:sz w:val="24"/>
+          <w:szCs w:val="24"/>
+        </w:rPr>
+        <w:t>, 2025</w:t>
+      </w:r>
+      <w:r>
+        <w:rPr>
+          <w:rFonts w:ascii="Times New Roman" w:hAnsi="Times New Roman" w:cs="Times New Roman"/>
+          <w:sz w:val="24"/>
+          <w:szCs w:val="24"/>
+        </w:rPr>
+        <w:tab/>
+        <w:t>2024</w:t>
+      </w:r>
+      <w:r>
+        <w:rPr>
+          <w:rFonts w:ascii="Times New Roman" w:hAnsi="Times New Roman" w:cs="Times New Roman"/>
+          <w:sz w:val="24"/>
+          <w:szCs w:val="24"/>
+        </w:rPr>
+        <w:t>, 2025</w:t>
+      </w:r>
+    </w:p>
+    <w:p>
+      <w:pPr>
+        <w:tabs>
+          <w:tab w:val="right" w:pos="9360"/>
+        </w:tabs>
+        <w:autoSpaceDE w:val="0"/>
+        <w:autoSpaceDN w:val="0"/>
+        <w:adjustRightInd w:val="0"/>
+        <w:spacing w:after="0" w:line="240" w:lineRule="auto"/>
+        <w:rPr>
+          <w:rFonts w:ascii="Times New Roman" w:hAnsi="Times New Roman" w:cs="Times New Roman"/>
+          <w:sz w:val="24"/>
+          <w:szCs w:val="24"/>
+        </w:rPr>
+      </w:pPr>
+      <w:r>
+        <w:rPr>
+          <w:rFonts w:ascii="Times New Roman" w:hAnsi="Times New Roman" w:cs="Times New Roman"/>
+          <w:sz w:val="24"/>
+          <w:szCs w:val="24"/>
+        </w:rPr>
+        <w:t>Member, NIST AI Safety Institute Task Force on Red Teaming                                              2024</w:t>
+      </w:r>
+    </w:p>
+    <w:p>
+      <w:pPr>
+        <w:tabs>
+          <w:tab w:val="right" w:pos="9360"/>
+        </w:tabs>
+        <w:autoSpaceDE w:val="0"/>
+        <w:autoSpaceDN w:val="0"/>
+        <w:adjustRightInd w:val="0"/>
+        <w:spacing w:after="0" w:line="240" w:lineRule="auto"/>
+        <w:jc w:val="center"/>
+        <w:rPr>
+          <w:rFonts w:ascii="Times New Roman" w:hAnsi="Times New Roman" w:cs="Times New Roman"/>
+          <w:sz w:val="24"/>
+          <w:szCs w:val="24"/>
+        </w:rPr>
+      </w:pPr>
+      <w:r>
+        <w:rPr>
+          <w:rFonts w:ascii="Times New Roman" w:hAnsi="Times New Roman" w:cs="Times New Roman"/>
+          <w:sz w:val="24"/>
+          <w:szCs w:val="24"/>
+        </w:rPr>
+        <w:t>Planning Committee, Hertz Foundation Summer Workshop                                                    2023</w:t>
+      </w:r>
+    </w:p>
+    <w:p>
+      <w:pPr>
+        <w:pBdr>
+          <w:bottom w:val="single" w:sz="4" w:space="1" w:color="auto"/>
+        </w:pBdr>
+        <w:spacing w:after="60"/>
+        <w:rPr>
+          <w:rFonts w:ascii="Times New Roman" w:hAnsi="Times New Roman" w:cs="Times New Roman"/>
+          <w:sz w:val="24"/>
+          <w:szCs w:val="24"/>
+        </w:rPr>
+      </w:pPr>
+      <w:r>
+        <w:rPr>
+          <w:rFonts w:ascii="Times New Roman" w:hAnsi="Times New Roman" w:cs="Times New Roman"/>
+          <w:sz w:val="24"/>
+          <w:szCs w:val="24"/>
+        </w:rPr>
+        <w:t xml:space="preserve">Reviewing: </w:t>
+      </w:r>
+      <w:proofErr w:type="spellStart"/>
+      <w:r>
+        <w:rPr>
+          <w:rFonts w:ascii="Times New Roman" w:hAnsi="Times New Roman" w:cs="Times New Roman"/>
+          <w:sz w:val="24"/>
+          <w:szCs w:val="24"/>
+        </w:rPr>
+        <w:t>NeurIPS</w:t>
+      </w:r>
+      <w:proofErr w:type="spellEnd"/>
+      <w:r>
+        <w:rPr>
+          <w:rFonts w:ascii="Times New Roman" w:hAnsi="Times New Roman" w:cs="Times New Roman"/>
+          <w:sz w:val="24"/>
+          <w:szCs w:val="24"/>
+        </w:rPr>
+        <w:t xml:space="preserve">, </w:t>
+      </w:r>
+      <w:r>
+        <w:rPr>
+          <w:rFonts w:ascii="Times New Roman" w:hAnsi="Times New Roman" w:cs="Times New Roman"/>
+          <w:sz w:val="24"/>
+          <w:szCs w:val="24"/>
+        </w:rPr>
+        <w:t xml:space="preserve">ICML, </w:t>
+      </w:r>
+      <w:r>
+        <w:rPr>
+          <w:rFonts w:ascii="Times New Roman" w:hAnsi="Times New Roman" w:cs="Times New Roman"/>
+          <w:sz w:val="24"/>
+          <w:szCs w:val="24"/>
+        </w:rPr>
+        <w:t xml:space="preserve">ICLR, Journal of Computational Biology, </w:t>
       </w:r>
       <w:r>
         <w:rPr>
@@ -3013,6 +3653,7 @@
           <w:sz w:val="24"/>
           <w:szCs w:val="24"/>
         </w:rPr>
+        <w:lastRenderedPageBreak/>
         <w:t>Non-Resident Tutor, Mather House (Harvard University)</w:t>
       </w:r>
       <w:r>
@@ -3297,16 +3938,25 @@
           <w:sz w:val="24"/>
           <w:szCs w:val="24"/>
         </w:rPr>
-        <w:t xml:space="preserve">Genentech                                                                                                           </w:t>
-      </w:r>
-      <w:r>
-        <w:rPr>
-          <w:rFonts w:ascii="Times New Roman" w:hAnsi="Times New Roman" w:cs="Times New Roman"/>
-          <w:bCs/>
-          <w:sz w:val="24"/>
-          <w:szCs w:val="24"/>
-        </w:rPr>
-        <w:t>San Francisco, CA</w:t>
+        <w:t>Abridge</w:t>
+      </w:r>
+      <w:r>
+        <w:rPr>
+          <w:rFonts w:ascii="Times New Roman" w:hAnsi="Times New Roman" w:cs="Times New Roman"/>
+          <w:b/>
+          <w:sz w:val="24"/>
+          <w:szCs w:val="24"/>
+        </w:rPr>
+        <w:tab/>
+      </w:r>
+      <w:r>
+        <w:rPr>
+          <w:rFonts w:ascii="Times New Roman" w:hAnsi="Times New Roman" w:cs="Times New Roman"/>
+          <w:bCs/>
+          <w:sz w:val="24"/>
+          <w:szCs w:val="24"/>
+        </w:rPr>
+        <w:t>New York, NY</w:t>
       </w:r>
     </w:p>
     <w:p>
@@ -3334,8 +3984,7 @@
           <w:sz w:val="24"/>
           <w:szCs w:val="24"/>
         </w:rPr>
-        <w:lastRenderedPageBreak/>
-        <w:t>ML Research Inter</w:t>
+        <w:t>PhD Research Intern</w:t>
       </w:r>
       <w:r>
         <w:rPr>
@@ -3346,8 +3995,132 @@
           <w:sz w:val="24"/>
           <w:szCs w:val="24"/>
         </w:rPr>
-        <w:t xml:space="preserve">n                            </w:t>
-      </w:r>
+        <w:tab/>
+      </w:r>
+      <w:r>
+        <w:rPr>
+          <w:rFonts w:ascii="Times New Roman" w:hAnsi="Times New Roman" w:cs="Times New Roman"/>
+          <w:bCs/>
+          <w:sz w:val="24"/>
+          <w:szCs w:val="24"/>
+        </w:rPr>
+        <w:t>2026</w:t>
+      </w:r>
+    </w:p>
+    <w:p>
+      <w:pPr>
+        <w:tabs>
+          <w:tab w:val="right" w:pos="9360"/>
+        </w:tabs>
+        <w:autoSpaceDE w:val="0"/>
+        <w:autoSpaceDN w:val="0"/>
+        <w:adjustRightInd w:val="0"/>
+        <w:spacing w:after="0" w:line="240" w:lineRule="auto"/>
+        <w:rPr>
+          <w:rFonts w:ascii="Times New Roman" w:hAnsi="Times New Roman" w:cs="Times New Roman"/>
+          <w:bCs/>
+          <w:sz w:val="24"/>
+          <w:szCs w:val="24"/>
+        </w:rPr>
+      </w:pPr>
+      <w:r>
+        <w:rPr>
+          <w:rFonts w:ascii="Times New Roman" w:hAnsi="Times New Roman" w:cs="Times New Roman"/>
+          <w:bCs/>
+          <w:sz w:val="24"/>
+          <w:szCs w:val="24"/>
+        </w:rPr>
+        <w:t xml:space="preserve">Mentors: Alex </w:t>
+      </w:r>
+      <w:proofErr w:type="spellStart"/>
+      <w:r>
+        <w:rPr>
+          <w:rFonts w:ascii="Times New Roman" w:hAnsi="Times New Roman" w:cs="Times New Roman"/>
+          <w:bCs/>
+          <w:sz w:val="24"/>
+          <w:szCs w:val="24"/>
+        </w:rPr>
+        <w:t>Chouldechova</w:t>
+      </w:r>
+      <w:proofErr w:type="spellEnd"/>
+      <w:r>
+        <w:rPr>
+          <w:rFonts w:ascii="Times New Roman" w:hAnsi="Times New Roman" w:cs="Times New Roman"/>
+          <w:bCs/>
+          <w:sz w:val="24"/>
+          <w:szCs w:val="24"/>
+        </w:rPr>
+        <w:t>, Michael Oberst</w:t>
+      </w:r>
+    </w:p>
+    <w:p>
+      <w:pPr>
+        <w:tabs>
+          <w:tab w:val="right" w:pos="9360"/>
+        </w:tabs>
+        <w:autoSpaceDE w:val="0"/>
+        <w:autoSpaceDN w:val="0"/>
+        <w:adjustRightInd w:val="0"/>
+        <w:spacing w:after="0" w:line="240" w:lineRule="auto"/>
+        <w:rPr>
+          <w:rFonts w:ascii="Times New Roman" w:hAnsi="Times New Roman" w:cs="Times New Roman"/>
+          <w:bCs/>
+          <w:sz w:val="24"/>
+          <w:szCs w:val="24"/>
+        </w:rPr>
+      </w:pPr>
+    </w:p>
+    <w:p>
+      <w:pPr>
+        <w:tabs>
+          <w:tab w:val="right" w:pos="9360"/>
+        </w:tabs>
+        <w:autoSpaceDE w:val="0"/>
+        <w:autoSpaceDN w:val="0"/>
+        <w:adjustRightInd w:val="0"/>
+        <w:spacing w:after="0" w:line="240" w:lineRule="auto"/>
+        <w:rPr>
+          <w:rFonts w:ascii="Times New Roman" w:hAnsi="Times New Roman" w:cs="Times New Roman"/>
+          <w:bCs/>
+          <w:sz w:val="24"/>
+          <w:szCs w:val="24"/>
+        </w:rPr>
+      </w:pPr>
+      <w:r>
+        <w:rPr>
+          <w:rFonts w:ascii="Times New Roman" w:hAnsi="Times New Roman" w:cs="Times New Roman"/>
+          <w:b/>
+          <w:sz w:val="24"/>
+          <w:szCs w:val="24"/>
+        </w:rPr>
+        <w:t xml:space="preserve">Genentech                                                                                                           </w:t>
+      </w:r>
+      <w:r>
+        <w:rPr>
+          <w:rFonts w:ascii="Times New Roman" w:hAnsi="Times New Roman" w:cs="Times New Roman"/>
+          <w:bCs/>
+          <w:sz w:val="24"/>
+          <w:szCs w:val="24"/>
+        </w:rPr>
+        <w:t>San Francisco, CA</w:t>
+      </w:r>
+    </w:p>
+    <w:p>
+      <w:pPr>
+        <w:tabs>
+          <w:tab w:val="right" w:pos="9360"/>
+        </w:tabs>
+        <w:autoSpaceDE w:val="0"/>
+        <w:autoSpaceDN w:val="0"/>
+        <w:adjustRightInd w:val="0"/>
+        <w:spacing w:after="0" w:line="240" w:lineRule="auto"/>
+        <w:rPr>
+          <w:rFonts w:ascii="Times New Roman" w:hAnsi="Times New Roman" w:cs="Times New Roman"/>
+          <w:bCs/>
+          <w:sz w:val="24"/>
+          <w:szCs w:val="24"/>
+        </w:rPr>
+      </w:pPr>
       <w:r>
         <w:rPr>
           <w:rFonts w:ascii="Times New Roman" w:hAnsi="Times New Roman" w:cs="Times New Roman"/>
@@ -3357,6 +4130,28 @@
           <w:sz w:val="24"/>
           <w:szCs w:val="24"/>
         </w:rPr>
+        <w:t>ML Research Inter</w:t>
+      </w:r>
+      <w:r>
+        <w:rPr>
+          <w:rFonts w:ascii="Times New Roman" w:hAnsi="Times New Roman" w:cs="Times New Roman"/>
+          <w:bCs/>
+          <w:i/>
+          <w:iCs/>
+          <w:sz w:val="24"/>
+          <w:szCs w:val="24"/>
+        </w:rPr>
+        <w:t xml:space="preserve">n                            </w:t>
+      </w:r>
+      <w:r>
+        <w:rPr>
+          <w:rFonts w:ascii="Times New Roman" w:hAnsi="Times New Roman" w:cs="Times New Roman"/>
+          <w:bCs/>
+          <w:i/>
+          <w:iCs/>
+          <w:sz w:val="24"/>
+          <w:szCs w:val="24"/>
+        </w:rPr>
         <w:t xml:space="preserve">                                                                                       </w:t>
       </w:r>
       <w:r>
@@ -3367,6 +4162,52 @@
           <w:szCs w:val="24"/>
         </w:rPr>
         <w:t>2025</w:t>
+      </w:r>
+    </w:p>
+    <w:p>
+      <w:pPr>
+        <w:tabs>
+          <w:tab w:val="right" w:pos="9360"/>
+        </w:tabs>
+        <w:autoSpaceDE w:val="0"/>
+        <w:autoSpaceDN w:val="0"/>
+        <w:adjustRightInd w:val="0"/>
+        <w:spacing w:after="0" w:line="240" w:lineRule="auto"/>
+        <w:rPr>
+          <w:rFonts w:ascii="Times New Roman" w:hAnsi="Times New Roman" w:cs="Times New Roman"/>
+          <w:bCs/>
+          <w:sz w:val="24"/>
+          <w:szCs w:val="24"/>
+        </w:rPr>
+      </w:pPr>
+      <w:r>
+        <w:rPr>
+          <w:rFonts w:ascii="Times New Roman" w:hAnsi="Times New Roman" w:cs="Times New Roman"/>
+          <w:bCs/>
+          <w:sz w:val="24"/>
+          <w:szCs w:val="24"/>
+        </w:rPr>
+        <w:t xml:space="preserve">Mentors: </w:t>
+      </w:r>
+      <w:proofErr w:type="spellStart"/>
+      <w:r>
+        <w:rPr>
+          <w:rFonts w:ascii="Times New Roman" w:hAnsi="Times New Roman" w:cs="Times New Roman"/>
+          <w:bCs/>
+          <w:sz w:val="24"/>
+          <w:szCs w:val="24"/>
+        </w:rPr>
+        <w:t>Hanchen</w:t>
+      </w:r>
+      <w:proofErr w:type="spellEnd"/>
+      <w:r>
+        <w:rPr>
+          <w:rFonts w:ascii="Times New Roman" w:hAnsi="Times New Roman" w:cs="Times New Roman"/>
+          <w:bCs/>
+          <w:sz w:val="24"/>
+          <w:szCs w:val="24"/>
+        </w:rPr>
+        <w:t xml:space="preserve"> Wang, Aviv Regev</w:t>
       </w:r>
     </w:p>
     <w:p>
@@ -3673,7 +4514,7 @@
           <w:szCs w:val="24"/>
         </w:rPr>
       </w:pPr>
-      <w:hyperlink r:id="rId14" w:history="1">
+      <w:hyperlink r:id="rId15" w:history="1">
         <w:r>
           <w:rPr>
             <w:rStyle w:val="Hyperlink"/>
@@ -3684,114 +4525,6 @@
           <w:t>bab@csail.mit.edu</w:t>
         </w:r>
       </w:hyperlink>
-    </w:p>
-    <w:p>
-      <w:pPr>
-        <w:autoSpaceDE w:val="0"/>
-        <w:autoSpaceDN w:val="0"/>
-        <w:adjustRightInd w:val="0"/>
-        <w:spacing w:after="0" w:line="240" w:lineRule="auto"/>
-        <w:rPr>
-          <w:rFonts w:ascii="Times New Roman" w:hAnsi="Times New Roman" w:cs="Times New Roman"/>
-          <w:sz w:val="24"/>
-          <w:szCs w:val="24"/>
-        </w:rPr>
-      </w:pPr>
-    </w:p>
-    <w:p>
-      <w:pPr>
-        <w:autoSpaceDE w:val="0"/>
-        <w:autoSpaceDN w:val="0"/>
-        <w:adjustRightInd w:val="0"/>
-        <w:spacing w:after="0" w:line="240" w:lineRule="auto"/>
-        <w:rPr>
-          <w:rFonts w:ascii="Times New Roman" w:hAnsi="Times New Roman" w:cs="Times New Roman"/>
-          <w:sz w:val="24"/>
-          <w:szCs w:val="24"/>
-        </w:rPr>
-      </w:pPr>
-      <w:r>
-        <w:rPr>
-          <w:rFonts w:ascii="Times New Roman" w:hAnsi="Times New Roman" w:cs="Times New Roman"/>
-          <w:sz w:val="24"/>
-          <w:szCs w:val="24"/>
-        </w:rPr>
-        <w:t>Emma Pierson</w:t>
-      </w:r>
-    </w:p>
-    <w:p>
-      <w:pPr>
-        <w:autoSpaceDE w:val="0"/>
-        <w:autoSpaceDN w:val="0"/>
-        <w:adjustRightInd w:val="0"/>
-        <w:spacing w:after="0" w:line="240" w:lineRule="auto"/>
-        <w:rPr>
-          <w:rFonts w:ascii="Times New Roman" w:hAnsi="Times New Roman" w:cs="Times New Roman"/>
-          <w:sz w:val="24"/>
-          <w:szCs w:val="24"/>
-        </w:rPr>
-      </w:pPr>
-      <w:r>
-        <w:rPr>
-          <w:rFonts w:ascii="Times New Roman" w:hAnsi="Times New Roman" w:cs="Times New Roman"/>
-          <w:sz w:val="24"/>
-          <w:szCs w:val="24"/>
-        </w:rPr>
-        <w:t>University of California, Berkeley</w:t>
-      </w:r>
-    </w:p>
-    <w:p>
-      <w:pPr>
-        <w:autoSpaceDE w:val="0"/>
-        <w:autoSpaceDN w:val="0"/>
-        <w:adjustRightInd w:val="0"/>
-        <w:spacing w:after="0" w:line="240" w:lineRule="auto"/>
-        <w:rPr>
-          <w:rFonts w:ascii="Times New Roman" w:hAnsi="Times New Roman" w:cs="Times New Roman"/>
-          <w:sz w:val="24"/>
-          <w:szCs w:val="24"/>
-        </w:rPr>
-      </w:pPr>
-      <w:r>
-        <w:rPr>
-          <w:rFonts w:ascii="Times New Roman" w:hAnsi="Times New Roman" w:cs="Times New Roman"/>
-          <w:sz w:val="24"/>
-          <w:szCs w:val="24"/>
-        </w:rPr>
-        <w:t>Assistant Professor of Electrical Engineering and Computer Science</w:t>
-      </w:r>
-    </w:p>
-    <w:p>
-      <w:pPr>
-        <w:autoSpaceDE w:val="0"/>
-        <w:autoSpaceDN w:val="0"/>
-        <w:adjustRightInd w:val="0"/>
-        <w:spacing w:after="0" w:line="240" w:lineRule="auto"/>
-        <w:rPr>
-          <w:rFonts w:ascii="Times New Roman" w:hAnsi="Times New Roman" w:cs="Times New Roman"/>
-          <w:sz w:val="24"/>
-          <w:szCs w:val="24"/>
-        </w:rPr>
-      </w:pPr>
-      <w:hyperlink r:id="rId15" w:history="1">
-        <w:r>
-          <w:rPr>
-            <w:rStyle w:val="Hyperlink"/>
-            <w:rFonts w:ascii="Times New Roman" w:hAnsi="Times New Roman" w:cs="Times New Roman"/>
-            <w:sz w:val="24"/>
-            <w:szCs w:val="24"/>
-          </w:rPr>
-          <w:t>emma.pierson@berkeley.edu</w:t>
-        </w:r>
-      </w:hyperlink>
-      <w:r>
-        <w:rPr>
-          <w:rFonts w:ascii="Times New Roman" w:hAnsi="Times New Roman" w:cs="Times New Roman"/>
-          <w:sz w:val="24"/>
-          <w:szCs w:val="24"/>
-        </w:rPr>
-        <w:t xml:space="preserve"> </w:t>
-      </w:r>
     </w:p>
     <w:p>
       <w:pPr>
@@ -3921,6 +4654,127 @@
           <w:szCs w:val="24"/>
         </w:rPr>
       </w:pPr>
+      <w:r>
+        <w:rPr>
+          <w:rFonts w:ascii="Times New Roman" w:hAnsi="Times New Roman" w:cs="Times New Roman"/>
+          <w:sz w:val="24"/>
+          <w:szCs w:val="24"/>
+        </w:rPr>
+        <w:t>Emma Pierson</w:t>
+      </w:r>
+    </w:p>
+    <w:p>
+      <w:pPr>
+        <w:autoSpaceDE w:val="0"/>
+        <w:autoSpaceDN w:val="0"/>
+        <w:adjustRightInd w:val="0"/>
+        <w:spacing w:after="0" w:line="240" w:lineRule="auto"/>
+        <w:rPr>
+          <w:rFonts w:ascii="Times New Roman" w:hAnsi="Times New Roman" w:cs="Times New Roman"/>
+          <w:sz w:val="24"/>
+          <w:szCs w:val="24"/>
+        </w:rPr>
+      </w:pPr>
+      <w:r>
+        <w:rPr>
+          <w:rFonts w:ascii="Times New Roman" w:hAnsi="Times New Roman" w:cs="Times New Roman"/>
+          <w:sz w:val="24"/>
+          <w:szCs w:val="24"/>
+        </w:rPr>
+        <w:t>University of California, Berkeley</w:t>
+      </w:r>
+    </w:p>
+    <w:p>
+      <w:pPr>
+        <w:autoSpaceDE w:val="0"/>
+        <w:autoSpaceDN w:val="0"/>
+        <w:adjustRightInd w:val="0"/>
+        <w:spacing w:after="0" w:line="240" w:lineRule="auto"/>
+        <w:rPr>
+          <w:rFonts w:ascii="Times New Roman" w:hAnsi="Times New Roman" w:cs="Times New Roman"/>
+          <w:sz w:val="24"/>
+          <w:szCs w:val="24"/>
+        </w:rPr>
+      </w:pPr>
+      <w:r>
+        <w:rPr>
+          <w:rFonts w:ascii="Times New Roman" w:hAnsi="Times New Roman" w:cs="Times New Roman"/>
+          <w:sz w:val="24"/>
+          <w:szCs w:val="24"/>
+        </w:rPr>
+        <w:t>Assistant Professor of Electrical Engineering and Computer Science</w:t>
+      </w:r>
+    </w:p>
+    <w:p>
+      <w:pPr>
+        <w:autoSpaceDE w:val="0"/>
+        <w:autoSpaceDN w:val="0"/>
+        <w:adjustRightInd w:val="0"/>
+        <w:spacing w:after="0" w:line="240" w:lineRule="auto"/>
+        <w:rPr>
+          <w:rFonts w:ascii="Times New Roman" w:hAnsi="Times New Roman" w:cs="Times New Roman"/>
+          <w:sz w:val="24"/>
+          <w:szCs w:val="24"/>
+        </w:rPr>
+      </w:pPr>
+      <w:hyperlink r:id="rId17" w:history="1">
+        <w:r>
+          <w:rPr>
+            <w:rStyle w:val="Hyperlink"/>
+            <w:rFonts w:ascii="Times New Roman" w:hAnsi="Times New Roman" w:cs="Times New Roman"/>
+            <w:sz w:val="24"/>
+            <w:szCs w:val="24"/>
+          </w:rPr>
+          <w:t>emma.pierson@berkeley.edu</w:t>
+        </w:r>
+      </w:hyperlink>
+      <w:r>
+        <w:rPr>
+          <w:rFonts w:ascii="Times New Roman" w:hAnsi="Times New Roman" w:cs="Times New Roman"/>
+          <w:sz w:val="24"/>
+          <w:szCs w:val="24"/>
+        </w:rPr>
+        <w:t xml:space="preserve"> </w:t>
+      </w:r>
+    </w:p>
+    <w:p>
+      <w:pPr>
+        <w:autoSpaceDE w:val="0"/>
+        <w:autoSpaceDN w:val="0"/>
+        <w:adjustRightInd w:val="0"/>
+        <w:spacing w:after="0" w:line="240" w:lineRule="auto"/>
+        <w:rPr>
+          <w:rFonts w:ascii="Times New Roman" w:hAnsi="Times New Roman" w:cs="Times New Roman"/>
+          <w:sz w:val="24"/>
+          <w:szCs w:val="24"/>
+        </w:rPr>
+      </w:pPr>
+    </w:p>
+    <w:p>
+      <w:pPr>
+        <w:autoSpaceDE w:val="0"/>
+        <w:autoSpaceDN w:val="0"/>
+        <w:adjustRightInd w:val="0"/>
+        <w:spacing w:after="0" w:line="240" w:lineRule="auto"/>
+        <w:rPr>
+          <w:rFonts w:ascii="Times New Roman" w:hAnsi="Times New Roman" w:cs="Times New Roman"/>
+          <w:sz w:val="24"/>
+          <w:szCs w:val="24"/>
+        </w:rPr>
+      </w:pPr>
+    </w:p>
+    <w:p>
+      <w:pPr>
+        <w:autoSpaceDE w:val="0"/>
+        <w:autoSpaceDN w:val="0"/>
+        <w:adjustRightInd w:val="0"/>
+        <w:spacing w:after="0" w:line="240" w:lineRule="auto"/>
+        <w:rPr>
+          <w:rFonts w:ascii="Times New Roman" w:hAnsi="Times New Roman" w:cs="Times New Roman"/>
+          <w:sz w:val="24"/>
+          <w:szCs w:val="24"/>
+        </w:rPr>
+      </w:pPr>
     </w:p>
     <w:p>
       <w:pPr>
@@ -3962,12 +4816,7 @@
       </w:pPr>
     </w:p>
     <w:sectPr>
-      <w:headerReference w:type="even" r:id="rId17"/>
-      <w:headerReference w:type="default" r:id="rId18"/>
-      <w:footerReference w:type="even" r:id="rId19"/>
-      <w:footerReference w:type="default" r:id="rId20"/>
-      <w:headerReference w:type="first" r:id="rId21"/>
-      <w:footerReference w:type="first" r:id="rId22"/>
+      <w:footerReference w:type="default" r:id="rId18"/>
       <w:pgSz w:w="12240" w:h="15840"/>
       <w:pgMar w:top="1440" w:right="1440" w:bottom="1440" w:left="1440" w:header="720" w:footer="720" w:gutter="0"/>
       <w:cols w:space="720"/>
@@ -4007,16 +4856,6 @@
   <w:p>
     <w:pPr>
       <w:pStyle w:val="Footer"/>
-    </w:pPr>
-  </w:p>
-</w:ftr>
-</file>
-
-<file path=word/footer2.xml><?xml version="1.0" encoding="utf-8"?>
-<w:ftr xmlns:wpc="http://schemas.microsoft.com/office/word/2010/wordprocessingCanvas" xmlns:cx="http://schemas.microsoft.com/office/drawing/2014/chartex" xmlns:cx1="http://schemas.microsoft.com/office/drawing/2015/9/8/chartex" xmlns:cx2="http://schemas.microsoft.com/office/drawing/2015/10/21/chartex" xmlns:cx3="http://schemas.microsoft.com/office/drawing/2016/5/9/chartex" xmlns:cx4="http://schemas.microsoft.com/office/drawing/2016/5/10/chartex" xmlns:cx5="http://schemas.microsoft.com/office/drawing/2016/5/11/chartex" xmlns:cx6="http://schemas.microsoft.com/office/drawing/2016/5/12/chartex" xmlns:cx7="http://schemas.microsoft.com/office/drawing/2016/5/13/chartex" xmlns:cx8="http://schemas.microsoft.com/office/drawing/2016/5/14/chartex" xmlns:mc="http://schemas.openxmlformats.org/markup-compatibility/2006" xmlns:aink="http://schemas.microsoft.com/office/drawing/2016/ink" xmlns:am3d="http://schemas.microsoft.com/office/drawing/2017/model3d" xmlns:o="urn:schemas-microsoft-com:office:office" xmlns:oel="http://schemas.microsoft.com/office/2019/extlst" xmlns:r="http://schemas.openxmlformats.org/officeDocument/2006/relationships" xmlns:m="http://schemas.openxmlformats.org/officeDocument/2006/math" xmlns:v="urn:schemas-microsoft-com:vml" xmlns:wp14="http://schemas.microsoft.com/office/word/2010/wordprocessingDrawing" xmlns:wp="http://schemas.openxmlformats.org/drawingml/2006/wordprocessingDrawing" xmlns:w10="urn:schemas-microsoft-com:office:word" xmlns:w="http://schemas.openxmlformats.org/wordprocessingml/2006/main" xmlns:w14="http://schemas.microsoft.com/office/word/2010/wordml" xmlns:w15="http://schemas.microsoft.com/office/word/2012/wordml" xmlns:w16cex="http://schemas.microsoft.com/office/word/2018/wordml/cex" xmlns:w16cid="http://schemas.microsoft.com/office/word/2016/wordml/cid" xmlns:w16="http://schemas.microsoft.com/office/word/2018/wordml" xmlns:w16du="http://schemas.microsoft.com/office/word/2023/wordml/word16du" xmlns:w16sdtdh="http://schemas.microsoft.com/office/word/2020/wordml/sdtdatahash" xmlns:w16sdtfl="http://schemas.microsoft.com/office/word/2024/wordml/sdtformatlock" xmlns:w16se="http://schemas.microsoft.com/office/word/2015/wordml/symex" xmlns:wpg="http://schemas.microsoft.com/office/word/2010/wordprocessingGroup" xmlns:wpi="http://schemas.microsoft.com/office/word/2010/wordprocessingInk" xmlns:wne="http://schemas.microsoft.com/office/word/2006/wordml" xmlns:wps="http://schemas.microsoft.com/office/word/2010/wordprocessingShape" mc:Ignorable="w14 w15 w16se w16cid w16 w16cex w16sdtdh w16sdtfl w16du wp14">
-  <w:p>
-    <w:pPr>
-      <w:pStyle w:val="Footer"/>
       <w:jc w:val="right"/>
       <w:rPr>
         <w:rFonts w:ascii="Times New Roman" w:hAnsi="Times New Roman" w:cs="Times New Roman"/>
@@ -4038,42 +4877,26 @@
       <w:rPr>
         <w:rFonts w:ascii="Times New Roman" w:hAnsi="Times New Roman" w:cs="Times New Roman"/>
       </w:rPr>
-      <w:t>Decembe</w:t>
+      <w:t xml:space="preserve">April </w:t>
     </w:r>
     <w:r>
       <w:rPr>
         <w:rFonts w:ascii="Times New Roman" w:hAnsi="Times New Roman" w:cs="Times New Roman"/>
       </w:rPr>
-      <w:t>r</w:t>
+      <w:t>202</w:t>
     </w:r>
     <w:r>
       <w:rPr>
         <w:rFonts w:ascii="Times New Roman" w:hAnsi="Times New Roman" w:cs="Times New Roman"/>
       </w:rPr>
-      <w:t xml:space="preserve"> 202</w:t>
+      <w:t>6</w:t>
     </w:r>
     <w:r>
       <w:rPr>
         <w:rFonts w:ascii="Times New Roman" w:hAnsi="Times New Roman" w:cs="Times New Roman"/>
       </w:rPr>
-      <w:t>5</w:t>
-    </w:r>
-    <w:r>
-      <w:rPr>
-        <w:rFonts w:ascii="Times New Roman" w:hAnsi="Times New Roman" w:cs="Times New Roman"/>
-      </w:rPr>
       <w:t>)</w:t>
     </w:r>
-  </w:p>
-</w:ftr>
-</file>
-
-<file path=word/footer3.xml><?xml version="1.0" encoding="utf-8"?>
-<w:ftr xmlns:wpc="http://schemas.microsoft.com/office/word/2010/wordprocessingCanvas" xmlns:cx="http://schemas.microsoft.com/office/drawing/2014/chartex" xmlns:cx1="http://schemas.microsoft.com/office/drawing/2015/9/8/chartex" xmlns:cx2="http://schemas.microsoft.com/office/drawing/2015/10/21/chartex" xmlns:cx3="http://schemas.microsoft.com/office/drawing/2016/5/9/chartex" xmlns:cx4="http://schemas.microsoft.com/office/drawing/2016/5/10/chartex" xmlns:cx5="http://schemas.microsoft.com/office/drawing/2016/5/11/chartex" xmlns:cx6="http://schemas.microsoft.com/office/drawing/2016/5/12/chartex" xmlns:cx7="http://schemas.microsoft.com/office/drawing/2016/5/13/chartex" xmlns:cx8="http://schemas.microsoft.com/office/drawing/2016/5/14/chartex" xmlns:mc="http://schemas.openxmlformats.org/markup-compatibility/2006" xmlns:aink="http://schemas.microsoft.com/office/drawing/2016/ink" xmlns:am3d="http://schemas.microsoft.com/office/drawing/2017/model3d" xmlns:o="urn:schemas-microsoft-com:office:office" xmlns:oel="http://schemas.microsoft.com/office/2019/extlst" xmlns:r="http://schemas.openxmlformats.org/officeDocument/2006/relationships" xmlns:m="http://schemas.openxmlformats.org/officeDocument/2006/math" xmlns:v="urn:schemas-microsoft-com:vml" xmlns:wp14="http://schemas.microsoft.com/office/word/2010/wordprocessingDrawing" xmlns:wp="http://schemas.openxmlformats.org/drawingml/2006/wordprocessingDrawing" xmlns:w10="urn:schemas-microsoft-com:office:word" xmlns:w="http://schemas.openxmlformats.org/wordprocessingml/2006/main" xmlns:w14="http://schemas.microsoft.com/office/word/2010/wordml" xmlns:w15="http://schemas.microsoft.com/office/word/2012/wordml" xmlns:w16cex="http://schemas.microsoft.com/office/word/2018/wordml/cex" xmlns:w16cid="http://schemas.microsoft.com/office/word/2016/wordml/cid" xmlns:w16="http://schemas.microsoft.com/office/word/2018/wordml" xmlns:w16du="http://schemas.microsoft.com/office/word/2023/wordml/word16du" xmlns:w16sdtdh="http://schemas.microsoft.com/office/word/2020/wordml/sdtdatahash" xmlns:w16sdtfl="http://schemas.microsoft.com/office/word/2024/wordml/sdtformatlock" xmlns:w16se="http://schemas.microsoft.com/office/word/2015/wordml/symex" xmlns:wpg="http://schemas.microsoft.com/office/word/2010/wordprocessingGroup" xmlns:wpi="http://schemas.microsoft.com/office/word/2010/wordprocessingInk" xmlns:wne="http://schemas.microsoft.com/office/word/2006/wordml" xmlns:wps="http://schemas.microsoft.com/office/word/2010/wordprocessingShape" mc:Ignorable="w14 w15 w16se w16cid w16 w16cex w16sdtdh w16sdtfl w16du wp14">
-  <w:p>
-    <w:pPr>
-      <w:pStyle w:val="Footer"/>
-    </w:pPr>
   </w:p>
 </w:ftr>
 </file>
@@ -4101,36 +4924,6 @@
     </w:p>
   </w:footnote>
 </w:footnotes>
-</file>
-
-<file path=word/header1.xml><?xml version="1.0" encoding="utf-8"?>
-<w:hdr xmlns:wpc="http://schemas.microsoft.com/office/word/2010/wordprocessingCanvas" xmlns:cx="http://schemas.microsoft.com/office/drawing/2014/chartex" xmlns:cx1="http://schemas.microsoft.com/office/drawing/2015/9/8/chartex" xmlns:cx2="http://schemas.microsoft.com/office/drawing/2015/10/21/chartex" xmlns:cx3="http://schemas.microsoft.com/office/drawing/2016/5/9/chartex" xmlns:cx4="http://schemas.microsoft.com/office/drawing/2016/5/10/chartex" xmlns:cx5="http://schemas.microsoft.com/office/drawing/2016/5/11/chartex" xmlns:cx6="http://schemas.microsoft.com/office/drawing/2016/5/12/chartex" xmlns:cx7="http://schemas.microsoft.com/office/drawing/2016/5/13/chartex" xmlns:cx8="http://schemas.microsoft.com/office/drawing/2016/5/14/chartex" xmlns:mc="http://schemas.openxmlformats.org/markup-compatibility/2006" xmlns:aink="http://schemas.microsoft.com/office/drawing/2016/ink" xmlns:am3d="http://schemas.microsoft.com/office/drawing/2017/model3d" xmlns:o="urn:schemas-microsoft-com:office:office" xmlns:oel="http://schemas.microsoft.com/office/2019/extlst" xmlns:r="http://schemas.openxmlformats.org/officeDocument/2006/relationships" xmlns:m="http://schemas.openxmlformats.org/officeDocument/2006/math" xmlns:v="urn:schemas-microsoft-com:vml" xmlns:wp14="http://schemas.microsoft.com/office/word/2010/wordprocessingDrawing" xmlns:wp="http://schemas.openxmlformats.org/drawingml/2006/wordprocessingDrawing" xmlns:w10="urn:schemas-microsoft-com:office:word" xmlns:w="http://schemas.openxmlformats.org/wordprocessingml/2006/main" xmlns:w14="http://schemas.microsoft.com/office/word/2010/wordml" xmlns:w15="http://schemas.microsoft.com/office/word/2012/wordml" xmlns:w16cex="http://schemas.microsoft.com/office/word/2018/wordml/cex" xmlns:w16cid="http://schemas.microsoft.com/office/word/2016/wordml/cid" xmlns:w16="http://schemas.microsoft.com/office/word/2018/wordml" xmlns:w16du="http://schemas.microsoft.com/office/word/2023/wordml/word16du" xmlns:w16sdtdh="http://schemas.microsoft.com/office/word/2020/wordml/sdtdatahash" xmlns:w16sdtfl="http://schemas.microsoft.com/office/word/2024/wordml/sdtformatlock" xmlns:w16se="http://schemas.microsoft.com/office/word/2015/wordml/symex" xmlns:wpg="http://schemas.microsoft.com/office/word/2010/wordprocessingGroup" xmlns:wpi="http://schemas.microsoft.com/office/word/2010/wordprocessingInk" xmlns:wne="http://schemas.microsoft.com/office/word/2006/wordml" xmlns:wps="http://schemas.microsoft.com/office/word/2010/wordprocessingShape" mc:Ignorable="w14 w15 w16se w16cid w16 w16cex w16sdtdh w16sdtfl w16du wp14">
-  <w:p>
-    <w:pPr>
-      <w:pStyle w:val="Header"/>
-    </w:pPr>
-  </w:p>
-</w:hdr>
-</file>
-
-<file path=word/header2.xml><?xml version="1.0" encoding="utf-8"?>
-<w:hdr xmlns:wpc="http://schemas.microsoft.com/office/word/2010/wordprocessingCanvas" xmlns:cx="http://schemas.microsoft.com/office/drawing/2014/chartex" xmlns:cx1="http://schemas.microsoft.com/office/drawing/2015/9/8/chartex" xmlns:cx2="http://schemas.microsoft.com/office/drawing/2015/10/21/chartex" xmlns:cx3="http://schemas.microsoft.com/office/drawing/2016/5/9/chartex" xmlns:cx4="http://schemas.microsoft.com/office/drawing/2016/5/10/chartex" xmlns:cx5="http://schemas.microsoft.com/office/drawing/2016/5/11/chartex" xmlns:cx6="http://schemas.microsoft.com/office/drawing/2016/5/12/chartex" xmlns:cx7="http://schemas.microsoft.com/office/drawing/2016/5/13/chartex" xmlns:cx8="http://schemas.microsoft.com/office/drawing/2016/5/14/chartex" xmlns:mc="http://schemas.openxmlformats.org/markup-compatibility/2006" xmlns:aink="http://schemas.microsoft.com/office/drawing/2016/ink" xmlns:am3d="http://schemas.microsoft.com/office/drawing/2017/model3d" xmlns:o="urn:schemas-microsoft-com:office:office" xmlns:oel="http://schemas.microsoft.com/office/2019/extlst" xmlns:r="http://schemas.openxmlformats.org/officeDocument/2006/relationships" xmlns:m="http://schemas.openxmlformats.org/officeDocument/2006/math" xmlns:v="urn:schemas-microsoft-com:vml" xmlns:wp14="http://schemas.microsoft.com/office/word/2010/wordprocessingDrawing" xmlns:wp="http://schemas.openxmlformats.org/drawingml/2006/wordprocessingDrawing" xmlns:w10="urn:schemas-microsoft-com:office:word" xmlns:w="http://schemas.openxmlformats.org/wordprocessingml/2006/main" xmlns:w14="http://schemas.microsoft.com/office/word/2010/wordml" xmlns:w15="http://schemas.microsoft.com/office/word/2012/wordml" xmlns:w16cex="http://schemas.microsoft.com/office/word/2018/wordml/cex" xmlns:w16cid="http://schemas.microsoft.com/office/word/2016/wordml/cid" xmlns:w16="http://schemas.microsoft.com/office/word/2018/wordml" xmlns:w16du="http://schemas.microsoft.com/office/word/2023/wordml/word16du" xmlns:w16sdtdh="http://schemas.microsoft.com/office/word/2020/wordml/sdtdatahash" xmlns:w16sdtfl="http://schemas.microsoft.com/office/word/2024/wordml/sdtformatlock" xmlns:w16se="http://schemas.microsoft.com/office/word/2015/wordml/symex" xmlns:wpg="http://schemas.microsoft.com/office/word/2010/wordprocessingGroup" xmlns:wpi="http://schemas.microsoft.com/office/word/2010/wordprocessingInk" xmlns:wne="http://schemas.microsoft.com/office/word/2006/wordml" xmlns:wps="http://schemas.microsoft.com/office/word/2010/wordprocessingShape" mc:Ignorable="w14 w15 w16se w16cid w16 w16cex w16sdtdh w16sdtfl w16du wp14">
-  <w:p>
-    <w:pPr>
-      <w:pStyle w:val="Header"/>
-    </w:pPr>
-  </w:p>
-</w:hdr>
-</file>
-
-<file path=word/header3.xml><?xml version="1.0" encoding="utf-8"?>
-<w:hdr xmlns:wpc="http://schemas.microsoft.com/office/word/2010/wordprocessingCanvas" xmlns:cx="http://schemas.microsoft.com/office/drawing/2014/chartex" xmlns:cx1="http://schemas.microsoft.com/office/drawing/2015/9/8/chartex" xmlns:cx2="http://schemas.microsoft.com/office/drawing/2015/10/21/chartex" xmlns:cx3="http://schemas.microsoft.com/office/drawing/2016/5/9/chartex" xmlns:cx4="http://schemas.microsoft.com/office/drawing/2016/5/10/chartex" xmlns:cx5="http://schemas.microsoft.com/office/drawing/2016/5/11/chartex" xmlns:cx6="http://schemas.microsoft.com/office/drawing/2016/5/12/chartex" xmlns:cx7="http://schemas.microsoft.com/office/drawing/2016/5/13/chartex" xmlns:cx8="http://schemas.microsoft.com/office/drawing/2016/5/14/chartex" xmlns:mc="http://schemas.openxmlformats.org/markup-compatibility/2006" xmlns:aink="http://schemas.microsoft.com/office/drawing/2016/ink" xmlns:am3d="http://schemas.microsoft.com/office/drawing/2017/model3d" xmlns:o="urn:schemas-microsoft-com:office:office" xmlns:oel="http://schemas.microsoft.com/office/2019/extlst" xmlns:r="http://schemas.openxmlformats.org/officeDocument/2006/relationships" xmlns:m="http://schemas.openxmlformats.org/officeDocument/2006/math" xmlns:v="urn:schemas-microsoft-com:vml" xmlns:wp14="http://schemas.microsoft.com/office/word/2010/wordprocessingDrawing" xmlns:wp="http://schemas.openxmlformats.org/drawingml/2006/wordprocessingDrawing" xmlns:w10="urn:schemas-microsoft-com:office:word" xmlns:w="http://schemas.openxmlformats.org/wordprocessingml/2006/main" xmlns:w14="http://schemas.microsoft.com/office/word/2010/wordml" xmlns:w15="http://schemas.microsoft.com/office/word/2012/wordml" xmlns:w16cex="http://schemas.microsoft.com/office/word/2018/wordml/cex" xmlns:w16cid="http://schemas.microsoft.com/office/word/2016/wordml/cid" xmlns:w16="http://schemas.microsoft.com/office/word/2018/wordml" xmlns:w16du="http://schemas.microsoft.com/office/word/2023/wordml/word16du" xmlns:w16sdtdh="http://schemas.microsoft.com/office/word/2020/wordml/sdtdatahash" xmlns:w16sdtfl="http://schemas.microsoft.com/office/word/2024/wordml/sdtformatlock" xmlns:w16se="http://schemas.microsoft.com/office/word/2015/wordml/symex" xmlns:wpg="http://schemas.microsoft.com/office/word/2010/wordprocessingGroup" xmlns:wpi="http://schemas.microsoft.com/office/word/2010/wordprocessingInk" xmlns:wne="http://schemas.microsoft.com/office/word/2006/wordml" xmlns:wps="http://schemas.microsoft.com/office/word/2010/wordprocessingShape" mc:Ignorable="w14 w15 w16se w16cid w16 w16cex w16sdtdh w16sdtfl w16du wp14">
-  <w:p>
-    <w:pPr>
-      <w:pStyle w:val="Header"/>
-    </w:pPr>
-  </w:p>
-</w:hdr>
 </file>
 
 <file path=word/numbering.xml><?xml version="1.0" encoding="utf-8"?>
@@ -4703,7 +5496,7 @@
   <w:abstractNum w:abstractNumId="5" w15:restartNumberingAfterBreak="0">
     <w:nsid w:val="5A6A5DD2"/>
     <w:multiLevelType w:val="hybridMultilevel"/>
-    <w:tmpl w:val="B0D68F8A"/>
+    <w:tmpl w:val="F708951C"/>
     <w:lvl w:ilvl="0" w:tplc="04090001">
       <w:start w:val="1"/>
       <w:numFmt w:val="bullet"/>
@@ -4927,6 +5720,119 @@
     </w:lvl>
   </w:abstractNum>
   <w:abstractNum w:abstractNumId="7" w15:restartNumberingAfterBreak="0">
+    <w:nsid w:val="6AE06A6C"/>
+    <w:multiLevelType w:val="hybridMultilevel"/>
+    <w:tmpl w:val="07DCF634"/>
+    <w:lvl w:ilvl="0" w:tplc="04090001">
+      <w:start w:val="1"/>
+      <w:numFmt w:val="bullet"/>
+      <w:lvlText w:val=""/>
+      <w:lvlJc w:val="left"/>
+      <w:pPr>
+        <w:ind w:left="720" w:hanging="360"/>
+      </w:pPr>
+      <w:rPr>
+        <w:rFonts w:ascii="Symbol" w:hAnsi="Symbol" w:hint="default"/>
+      </w:rPr>
+    </w:lvl>
+    <w:lvl w:ilvl="1" w:tplc="04090003" w:tentative="1">
+      <w:start w:val="1"/>
+      <w:numFmt w:val="bullet"/>
+      <w:lvlText w:val="o"/>
+      <w:lvlJc w:val="left"/>
+      <w:pPr>
+        <w:ind w:left="1440" w:hanging="360"/>
+      </w:pPr>
+      <w:rPr>
+        <w:rFonts w:ascii="Courier New" w:hAnsi="Courier New" w:cs="Courier New" w:hint="default"/>
+      </w:rPr>
+    </w:lvl>
+    <w:lvl w:ilvl="2" w:tplc="04090005" w:tentative="1">
+      <w:start w:val="1"/>
+      <w:numFmt w:val="bullet"/>
+      <w:lvlText w:val=""/>
+      <w:lvlJc w:val="left"/>
+      <w:pPr>
+        <w:ind w:left="2160" w:hanging="360"/>
+      </w:pPr>
+      <w:rPr>
+        <w:rFonts w:ascii="Wingdings" w:hAnsi="Wingdings" w:hint="default"/>
+      </w:rPr>
+    </w:lvl>
+    <w:lvl w:ilvl="3" w:tplc="04090001" w:tentative="1">
+      <w:start w:val="1"/>
+      <w:numFmt w:val="bullet"/>
+      <w:lvlText w:val=""/>
+      <w:lvlJc w:val="left"/>
+      <w:pPr>
+        <w:ind w:left="2880" w:hanging="360"/>
+      </w:pPr>
+      <w:rPr>
+        <w:rFonts w:ascii="Symbol" w:hAnsi="Symbol" w:hint="default"/>
+      </w:rPr>
+    </w:lvl>
+    <w:lvl w:ilvl="4" w:tplc="04090003" w:tentative="1">
+      <w:start w:val="1"/>
+      <w:numFmt w:val="bullet"/>
+      <w:lvlText w:val="o"/>
+      <w:lvlJc w:val="left"/>
+      <w:pPr>
+        <w:ind w:left="3600" w:hanging="360"/>
+      </w:pPr>
+      <w:rPr>
+        <w:rFonts w:ascii="Courier New" w:hAnsi="Courier New" w:cs="Courier New" w:hint="default"/>
+      </w:rPr>
+    </w:lvl>
+    <w:lvl w:ilvl="5" w:tplc="04090005" w:tentative="1">
+      <w:start w:val="1"/>
+      <w:numFmt w:val="bullet"/>
+      <w:lvlText w:val=""/>
+      <w:lvlJc w:val="left"/>
+      <w:pPr>
+        <w:ind w:left="4320" w:hanging="360"/>
+      </w:pPr>
+      <w:rPr>
+        <w:rFonts w:ascii="Wingdings" w:hAnsi="Wingdings" w:hint="default"/>
+      </w:rPr>
+    </w:lvl>
+    <w:lvl w:ilvl="6" w:tplc="04090001" w:tentative="1">
+      <w:start w:val="1"/>
+      <w:numFmt w:val="bullet"/>
+      <w:lvlText w:val=""/>
+      <w:lvlJc w:val="left"/>
+      <w:pPr>
+        <w:ind w:left="5040" w:hanging="360"/>
+      </w:pPr>
+      <w:rPr>
+        <w:rFonts w:ascii="Symbol" w:hAnsi="Symbol" w:hint="default"/>
+      </w:rPr>
+    </w:lvl>
+    <w:lvl w:ilvl="7" w:tplc="04090003" w:tentative="1">
+      <w:start w:val="1"/>
+      <w:numFmt w:val="bullet"/>
+      <w:lvlText w:val="o"/>
+      <w:lvlJc w:val="left"/>
+      <w:pPr>
+        <w:ind w:left="5760" w:hanging="360"/>
+      </w:pPr>
+      <w:rPr>
+        <w:rFonts w:ascii="Courier New" w:hAnsi="Courier New" w:cs="Courier New" w:hint="default"/>
+      </w:rPr>
+    </w:lvl>
+    <w:lvl w:ilvl="8" w:tplc="04090005" w:tentative="1">
+      <w:start w:val="1"/>
+      <w:numFmt w:val="bullet"/>
+      <w:lvlText w:val=""/>
+      <w:lvlJc w:val="left"/>
+      <w:pPr>
+        <w:ind w:left="6480" w:hanging="360"/>
+      </w:pPr>
+      <w:rPr>
+        <w:rFonts w:ascii="Wingdings" w:hAnsi="Wingdings" w:hint="default"/>
+      </w:rPr>
+    </w:lvl>
+  </w:abstractNum>
+  <w:abstractNum w:abstractNumId="8" w15:restartNumberingAfterBreak="0">
     <w:nsid w:val="6EF8748C"/>
     <w:multiLevelType w:val="hybridMultilevel"/>
     <w:tmpl w:val="F138B0D6"/>
@@ -5039,7 +5945,7 @@
       </w:rPr>
     </w:lvl>
   </w:abstractNum>
-  <w:abstractNum w:abstractNumId="8" w15:restartNumberingAfterBreak="0">
+  <w:abstractNum w:abstractNumId="9" w15:restartNumberingAfterBreak="0">
     <w:nsid w:val="79587802"/>
     <w:multiLevelType w:val="hybridMultilevel"/>
     <w:tmpl w:val="7430C8CC"/>
@@ -5152,7 +6058,7 @@
       </w:rPr>
     </w:lvl>
   </w:abstractNum>
-  <w:abstractNum w:abstractNumId="9" w15:restartNumberingAfterBreak="0">
+  <w:abstractNum w:abstractNumId="10" w15:restartNumberingAfterBreak="0">
     <w:nsid w:val="7C5A61C2"/>
     <w:multiLevelType w:val="hybridMultilevel"/>
     <w:tmpl w:val="29DE708C"/>
@@ -5281,19 +6187,22 @@
     <w:abstractNumId w:val="3"/>
   </w:num>
   <w:num w:numId="6" w16cid:durableId="1067875030">
-    <w:abstractNumId w:val="8"/>
+    <w:abstractNumId w:val="9"/>
   </w:num>
   <w:num w:numId="7" w16cid:durableId="1115979560">
-    <w:abstractNumId w:val="9"/>
+    <w:abstractNumId w:val="10"/>
   </w:num>
   <w:num w:numId="8" w16cid:durableId="2001494621">
     <w:abstractNumId w:val="5"/>
   </w:num>
   <w:num w:numId="9" w16cid:durableId="983238221">
-    <w:abstractNumId w:val="7"/>
+    <w:abstractNumId w:val="8"/>
   </w:num>
   <w:num w:numId="10" w16cid:durableId="1048991147">
     <w:abstractNumId w:val="4"/>
+  </w:num>
+  <w:num w:numId="11" w16cid:durableId="1318921394">
+    <w:abstractNumId w:val="7"/>
   </w:num>
 </w:numbering>
 </file>

</xml_diff>

<commit_message>
Deploying to gh-pages from @ shuvom-s/shuvom-s.github.io@340ac1e9c2ae4bd7b3655a94894e3b1cc23e9693 🚀
</commit_message>
<xml_diff>
--- a/assets/pdf/cv_dec25.docx
+++ b/assets/pdf/cv_dec25.docx
@@ -819,7 +819,27 @@
           <w:sz w:val="24"/>
           <w:szCs w:val="24"/>
         </w:rPr>
-        <w:t xml:space="preserve">, D. Prinster, C. Fannjiang, G. Scalia, A. Regev, H. Wang. </w:t>
+        <w:t xml:space="preserve">, D. Prinster, C. </w:t>
+      </w:r>
+      <w:proofErr w:type="spellStart"/>
+      <w:r>
+        <w:rPr>
+          <w:rFonts w:ascii="Times New Roman" w:hAnsi="Times New Roman" w:cs="Times New Roman"/>
+          <w:bCs/>
+          <w:sz w:val="24"/>
+          <w:szCs w:val="24"/>
+        </w:rPr>
+        <w:t>Fannjiang</w:t>
+      </w:r>
+      <w:proofErr w:type="spellEnd"/>
+      <w:r>
+        <w:rPr>
+          <w:rFonts w:ascii="Times New Roman" w:hAnsi="Times New Roman" w:cs="Times New Roman"/>
+          <w:bCs/>
+          <w:sz w:val="24"/>
+          <w:szCs w:val="24"/>
+        </w:rPr>
+        <w:t xml:space="preserve">, G. Scalia, A. Regev, H. Wang. </w:t>
       </w:r>
       <w:r>
         <w:rPr>
@@ -905,26 +925,38 @@
         </w:rPr>
         <w:t>Preprint (</w:t>
       </w:r>
-      <w:hyperlink r:id="rId9" w:history="1">
-        <w:r>
-          <w:rPr>
-            <w:rStyle w:val="Hyperlink"/>
-            <w:rFonts w:ascii="Times New Roman" w:hAnsi="Times New Roman" w:cs="Times New Roman"/>
-            <w:bCs/>
-            <w:sz w:val="24"/>
-            <w:szCs w:val="24"/>
-          </w:rPr>
-          <w:t>arxiv</w:t>
-        </w:r>
-      </w:hyperlink>
-      <w:r>
-        <w:rPr>
-          <w:rFonts w:ascii="Times New Roman" w:hAnsi="Times New Roman" w:cs="Times New Roman"/>
-          <w:bCs/>
-          <w:sz w:val="24"/>
-          <w:szCs w:val="24"/>
-        </w:rPr>
-        <w:t xml:space="preserve">) </w:t>
+      <w:proofErr w:type="spellStart"/>
+      <w:r>
+        <w:fldChar w:fldCharType="begin"/>
+      </w:r>
+      <w:r>
+        <w:instrText>HYPERLINK "https://arxiv.org/abs/2512.03109"</w:instrText>
+      </w:r>
+      <w:r>
+        <w:fldChar w:fldCharType="separate"/>
+      </w:r>
+      <w:r>
+        <w:rPr>
+          <w:rStyle w:val="Hyperlink"/>
+          <w:rFonts w:ascii="Times New Roman" w:hAnsi="Times New Roman" w:cs="Times New Roman"/>
+          <w:bCs/>
+          <w:sz w:val="24"/>
+          <w:szCs w:val="24"/>
+        </w:rPr>
+        <w:t>arxiv</w:t>
+      </w:r>
+      <w:proofErr w:type="spellEnd"/>
+      <w:r>
+        <w:fldChar w:fldCharType="end"/>
+      </w:r>
+      <w:r>
+        <w:rPr>
+          <w:rFonts w:ascii="Times New Roman" w:hAnsi="Times New Roman" w:cs="Times New Roman"/>
+          <w:bCs/>
+          <w:sz w:val="24"/>
+          <w:szCs w:val="24"/>
+        </w:rPr>
+        <w:t>)</w:t>
       </w:r>
     </w:p>
     <w:p>
@@ -1121,7 +1153,27 @@
           <w:sz w:val="24"/>
           <w:szCs w:val="24"/>
         </w:rPr>
-        <w:t>. NeurIPS 2025</w:t>
+        <w:t xml:space="preserve">. </w:t>
+      </w:r>
+      <w:proofErr w:type="spellStart"/>
+      <w:r>
+        <w:rPr>
+          <w:rFonts w:ascii="Times New Roman" w:hAnsi="Times New Roman" w:cs="Times New Roman"/>
+          <w:bCs/>
+          <w:sz w:val="24"/>
+          <w:szCs w:val="24"/>
+        </w:rPr>
+        <w:t>NeurIPS</w:t>
+      </w:r>
+      <w:proofErr w:type="spellEnd"/>
+      <w:r>
+        <w:rPr>
+          <w:rFonts w:ascii="Times New Roman" w:hAnsi="Times New Roman" w:cs="Times New Roman"/>
+          <w:bCs/>
+          <w:sz w:val="24"/>
+          <w:szCs w:val="24"/>
+        </w:rPr>
+        <w:t xml:space="preserve"> 2025</w:t>
       </w:r>
     </w:p>
     <w:p>
@@ -1326,7 +1378,27 @@
           <w:sz w:val="24"/>
           <w:szCs w:val="24"/>
         </w:rPr>
-        <w:t xml:space="preserve">H. Cho, D. Froelicher*, N. Dokmai*, A. Nandi*, </w:t>
+        <w:t xml:space="preserve">H. Cho, D. Froelicher*, N. </w:t>
+      </w:r>
+      <w:proofErr w:type="spellStart"/>
+      <w:r>
+        <w:rPr>
+          <w:rFonts w:ascii="Times New Roman" w:hAnsi="Times New Roman" w:cs="Times New Roman"/>
+          <w:bCs/>
+          <w:sz w:val="24"/>
+          <w:szCs w:val="24"/>
+        </w:rPr>
+        <w:t>Dokmai</w:t>
+      </w:r>
+      <w:proofErr w:type="spellEnd"/>
+      <w:r>
+        <w:rPr>
+          <w:rFonts w:ascii="Times New Roman" w:hAnsi="Times New Roman" w:cs="Times New Roman"/>
+          <w:bCs/>
+          <w:sz w:val="24"/>
+          <w:szCs w:val="24"/>
+        </w:rPr>
+        <w:t xml:space="preserve">*, A. Nandi*, </w:t>
       </w:r>
       <w:r>
         <w:rPr>
@@ -1642,6 +1714,7 @@
         </w:rPr>
         <w:t xml:space="preserve">Topological </w:t>
       </w:r>
+      <w:proofErr w:type="spellStart"/>
       <w:r>
         <w:rPr>
           <w:rFonts w:ascii="Times New Roman" w:hAnsi="Times New Roman" w:cs="Times New Roman"/>
@@ -1662,7 +1735,19 @@
           <w:sz w:val="24"/>
           <w:szCs w:val="24"/>
         </w:rPr>
-        <w:t xml:space="preserve">hononic </w:t>
+        <w:t>hononic</w:t>
+      </w:r>
+      <w:proofErr w:type="spellEnd"/>
+      <w:r>
+        <w:rPr>
+          <w:rFonts w:ascii="Times New Roman" w:hAnsi="Times New Roman" w:cs="Times New Roman"/>
+          <w:bCs/>
+          <w:i/>
+          <w:iCs/>
+          <w:sz w:val="24"/>
+          <w:szCs w:val="24"/>
+        </w:rPr>
+        <w:t xml:space="preserve"> </w:t>
       </w:r>
       <w:r>
         <w:rPr>
@@ -1772,7 +1857,7 @@
         </w:rPr>
         <w:t xml:space="preserve">Press: </w:t>
       </w:r>
-      <w:hyperlink r:id="rId10" w:history="1">
+      <w:hyperlink r:id="rId9" w:history="1">
         <w:r>
           <w:rPr>
             <w:rStyle w:val="Hyperlink"/>
@@ -1797,7 +1882,7 @@
         </w:rPr>
         <w:t xml:space="preserve">, </w:t>
       </w:r>
-      <w:hyperlink r:id="rId11" w:history="1">
+      <w:hyperlink r:id="rId10" w:history="1">
         <w:r>
           <w:rPr>
             <w:rStyle w:val="Hyperlink"/>
@@ -1822,7 +1907,7 @@
         </w:rPr>
         <w:t xml:space="preserve">, </w:t>
       </w:r>
-      <w:hyperlink r:id="rId12" w:history="1">
+      <w:hyperlink r:id="rId11" w:history="1">
         <w:r>
           <w:rPr>
             <w:rStyle w:val="Hyperlink"/>
@@ -1847,7 +1932,8 @@
         </w:rPr>
         <w:t xml:space="preserve">, </w:t>
       </w:r>
-      <w:hyperlink r:id="rId13" w:history="1">
+      <w:hyperlink r:id="rId12" w:history="1">
+        <w:proofErr w:type="spellStart"/>
         <w:r>
           <w:rPr>
             <w:rStyle w:val="Hyperlink"/>
@@ -1860,6 +1946,7 @@
           </w:rPr>
           <w:t>Hackaday</w:t>
         </w:r>
+        <w:proofErr w:type="spellEnd"/>
       </w:hyperlink>
     </w:p>
     <w:p>
@@ -1905,7 +1992,27 @@
           <w:sz w:val="24"/>
           <w:szCs w:val="24"/>
         </w:rPr>
-        <w:t xml:space="preserve">Q. Wang, D. Kelley, J. Ulrisch, M. Kanai, </w:t>
+        <w:t xml:space="preserve">Q. Wang, D. Kelley, J. </w:t>
+      </w:r>
+      <w:proofErr w:type="spellStart"/>
+      <w:r>
+        <w:rPr>
+          <w:rFonts w:ascii="Times New Roman" w:hAnsi="Times New Roman" w:cs="Times New Roman"/>
+          <w:bCs/>
+          <w:sz w:val="24"/>
+          <w:szCs w:val="24"/>
+        </w:rPr>
+        <w:t>Ulrisch</w:t>
+      </w:r>
+      <w:proofErr w:type="spellEnd"/>
+      <w:r>
+        <w:rPr>
+          <w:rFonts w:ascii="Times New Roman" w:hAnsi="Times New Roman" w:cs="Times New Roman"/>
+          <w:bCs/>
+          <w:sz w:val="24"/>
+          <w:szCs w:val="24"/>
+        </w:rPr>
+        <w:t xml:space="preserve">, M. Kanai, </w:t>
       </w:r>
       <w:r>
         <w:rPr>
@@ -1924,7 +2031,67 @@
           <w:sz w:val="24"/>
           <w:szCs w:val="24"/>
         </w:rPr>
-        <w:t xml:space="preserve">, R. Cui, C. Albors, N. Cheng, Y. Okada, Biobank Japan Project, F. Aguet, K. Ardlie, D. MacArthur, H. Finucane. </w:t>
+        <w:t xml:space="preserve">, R. Cui, C. </w:t>
+      </w:r>
+      <w:proofErr w:type="spellStart"/>
+      <w:r>
+        <w:rPr>
+          <w:rFonts w:ascii="Times New Roman" w:hAnsi="Times New Roman" w:cs="Times New Roman"/>
+          <w:bCs/>
+          <w:sz w:val="24"/>
+          <w:szCs w:val="24"/>
+        </w:rPr>
+        <w:t>Albors</w:t>
+      </w:r>
+      <w:proofErr w:type="spellEnd"/>
+      <w:r>
+        <w:rPr>
+          <w:rFonts w:ascii="Times New Roman" w:hAnsi="Times New Roman" w:cs="Times New Roman"/>
+          <w:bCs/>
+          <w:sz w:val="24"/>
+          <w:szCs w:val="24"/>
+        </w:rPr>
+        <w:t xml:space="preserve">, N. Cheng, Y. Okada, Biobank Japan Project, F. </w:t>
+      </w:r>
+      <w:proofErr w:type="spellStart"/>
+      <w:r>
+        <w:rPr>
+          <w:rFonts w:ascii="Times New Roman" w:hAnsi="Times New Roman" w:cs="Times New Roman"/>
+          <w:bCs/>
+          <w:sz w:val="24"/>
+          <w:szCs w:val="24"/>
+        </w:rPr>
+        <w:t>Aguet</w:t>
+      </w:r>
+      <w:proofErr w:type="spellEnd"/>
+      <w:r>
+        <w:rPr>
+          <w:rFonts w:ascii="Times New Roman" w:hAnsi="Times New Roman" w:cs="Times New Roman"/>
+          <w:bCs/>
+          <w:sz w:val="24"/>
+          <w:szCs w:val="24"/>
+        </w:rPr>
+        <w:t xml:space="preserve">, K. </w:t>
+      </w:r>
+      <w:proofErr w:type="spellStart"/>
+      <w:r>
+        <w:rPr>
+          <w:rFonts w:ascii="Times New Roman" w:hAnsi="Times New Roman" w:cs="Times New Roman"/>
+          <w:bCs/>
+          <w:sz w:val="24"/>
+          <w:szCs w:val="24"/>
+        </w:rPr>
+        <w:t>Ardlie</w:t>
+      </w:r>
+      <w:proofErr w:type="spellEnd"/>
+      <w:r>
+        <w:rPr>
+          <w:rFonts w:ascii="Times New Roman" w:hAnsi="Times New Roman" w:cs="Times New Roman"/>
+          <w:bCs/>
+          <w:sz w:val="24"/>
+          <w:szCs w:val="24"/>
+        </w:rPr>
+        <w:t xml:space="preserve">, D. MacArthur, H. Finucane. </w:t>
       </w:r>
       <w:r>
         <w:rPr>
@@ -1935,7 +2102,55 @@
           <w:sz w:val="24"/>
           <w:szCs w:val="24"/>
         </w:rPr>
-        <w:t>Leveraging supervised learning for functionally informed fine-mapping of cis-eQTLs identifies an additional 20,913 putative causal eQTLs. Nature Communications</w:t>
+        <w:t>Leveraging supervised learning for functionally informed fine-mapping of cis-</w:t>
+      </w:r>
+      <w:proofErr w:type="spellStart"/>
+      <w:r>
+        <w:rPr>
+          <w:rFonts w:ascii="Times New Roman" w:hAnsi="Times New Roman" w:cs="Times New Roman"/>
+          <w:bCs/>
+          <w:i/>
+          <w:iCs/>
+          <w:sz w:val="24"/>
+          <w:szCs w:val="24"/>
+        </w:rPr>
+        <w:t>eQTLs</w:t>
+      </w:r>
+      <w:proofErr w:type="spellEnd"/>
+      <w:r>
+        <w:rPr>
+          <w:rFonts w:ascii="Times New Roman" w:hAnsi="Times New Roman" w:cs="Times New Roman"/>
+          <w:bCs/>
+          <w:i/>
+          <w:iCs/>
+          <w:sz w:val="24"/>
+          <w:szCs w:val="24"/>
+        </w:rPr>
+        <w:t xml:space="preserve"> identifies an additional 20,913 putative causal </w:t>
+      </w:r>
+      <w:proofErr w:type="spellStart"/>
+      <w:r>
+        <w:rPr>
+          <w:rFonts w:ascii="Times New Roman" w:hAnsi="Times New Roman" w:cs="Times New Roman"/>
+          <w:bCs/>
+          <w:i/>
+          <w:iCs/>
+          <w:sz w:val="24"/>
+          <w:szCs w:val="24"/>
+        </w:rPr>
+        <w:t>eQTLs</w:t>
+      </w:r>
+      <w:proofErr w:type="spellEnd"/>
+      <w:r>
+        <w:rPr>
+          <w:rFonts w:ascii="Times New Roman" w:hAnsi="Times New Roman" w:cs="Times New Roman"/>
+          <w:bCs/>
+          <w:i/>
+          <w:iCs/>
+          <w:sz w:val="24"/>
+          <w:szCs w:val="24"/>
+        </w:rPr>
+        <w:t>. Nature Communications</w:t>
       </w:r>
       <w:r>
         <w:rPr>
@@ -2133,9 +2348,385 @@
         <w:pBdr>
           <w:bottom w:val="single" w:sz="4" w:space="1" w:color="auto"/>
         </w:pBdr>
+        <w:spacing w:after="60"/>
+        <w:rPr>
+          <w:rFonts w:ascii="Times New Roman" w:hAnsi="Times New Roman" w:cs="Times New Roman"/>
+          <w:b/>
+          <w:sz w:val="24"/>
+          <w:szCs w:val="24"/>
+        </w:rPr>
+      </w:pPr>
+    </w:p>
+    <w:p>
+      <w:pPr>
+        <w:pBdr>
+          <w:bottom w:val="single" w:sz="4" w:space="1" w:color="auto"/>
+        </w:pBdr>
+        <w:spacing w:after="60"/>
+        <w:rPr>
+          <w:rFonts w:ascii="Times New Roman" w:hAnsi="Times New Roman" w:cs="Times New Roman"/>
+          <w:b/>
+          <w:sz w:val="24"/>
+          <w:szCs w:val="24"/>
+        </w:rPr>
+      </w:pPr>
+      <w:r>
+        <w:rPr>
+          <w:rFonts w:ascii="Times New Roman" w:hAnsi="Times New Roman" w:cs="Times New Roman"/>
+          <w:b/>
+          <w:sz w:val="24"/>
+          <w:szCs w:val="24"/>
+        </w:rPr>
+        <w:t>TALKS</w:t>
+      </w:r>
+      <w:r>
+        <w:rPr>
+          <w:rFonts w:ascii="Times New Roman" w:hAnsi="Times New Roman" w:cs="Times New Roman"/>
+          <w:b/>
+          <w:sz w:val="24"/>
+          <w:szCs w:val="24"/>
+        </w:rPr>
+        <w:t xml:space="preserve"> &amp; PRESENTATIONS</w:t>
+      </w:r>
+    </w:p>
+    <w:p>
+      <w:pPr>
         <w:tabs>
           <w:tab w:val="right" w:pos="9360"/>
         </w:tabs>
+        <w:autoSpaceDE w:val="0"/>
+        <w:autoSpaceDN w:val="0"/>
+        <w:adjustRightInd w:val="0"/>
+        <w:spacing w:after="0" w:line="240" w:lineRule="auto"/>
+        <w:rPr>
+          <w:rFonts w:ascii="Times New Roman" w:hAnsi="Times New Roman" w:cs="Times New Roman"/>
+          <w:b/>
+          <w:bCs/>
+          <w:sz w:val="24"/>
+          <w:szCs w:val="24"/>
+        </w:rPr>
+      </w:pPr>
+      <w:r>
+        <w:rPr>
+          <w:rFonts w:ascii="Times New Roman" w:hAnsi="Times New Roman" w:cs="Times New Roman"/>
+          <w:b/>
+          <w:bCs/>
+          <w:sz w:val="24"/>
+          <w:szCs w:val="24"/>
+        </w:rPr>
+        <w:t>E-valuator: Reliable Agent Verifiers with Sequential Hypothesis Testing</w:t>
+      </w:r>
+    </w:p>
+    <w:p>
+      <w:pPr>
+        <w:tabs>
+          <w:tab w:val="right" w:pos="9360"/>
+        </w:tabs>
+        <w:autoSpaceDE w:val="0"/>
+        <w:autoSpaceDN w:val="0"/>
+        <w:adjustRightInd w:val="0"/>
+        <w:spacing w:after="0" w:line="240" w:lineRule="auto"/>
+        <w:rPr>
+          <w:rFonts w:ascii="Times New Roman" w:hAnsi="Times New Roman" w:cs="Times New Roman"/>
+          <w:sz w:val="24"/>
+          <w:szCs w:val="24"/>
+        </w:rPr>
+      </w:pPr>
+      <w:r>
+        <w:rPr>
+          <w:rFonts w:ascii="Times New Roman" w:hAnsi="Times New Roman" w:cs="Times New Roman"/>
+          <w:sz w:val="24"/>
+          <w:szCs w:val="24"/>
+        </w:rPr>
+        <w:t>Rational Intelligence Seminar Series</w:t>
+      </w:r>
+      <w:r>
+        <w:rPr>
+          <w:rFonts w:ascii="Times New Roman" w:hAnsi="Times New Roman" w:cs="Times New Roman"/>
+          <w:sz w:val="24"/>
+          <w:szCs w:val="24"/>
+        </w:rPr>
+        <w:t xml:space="preserve"> [</w:t>
+      </w:r>
+      <w:hyperlink r:id="rId13" w:history="1">
+        <w:r>
+          <w:rPr>
+            <w:rStyle w:val="Hyperlink"/>
+            <w:rFonts w:ascii="Times New Roman" w:hAnsi="Times New Roman" w:cs="Times New Roman"/>
+            <w:sz w:val="24"/>
+            <w:szCs w:val="24"/>
+          </w:rPr>
+          <w:t>YouTube</w:t>
+        </w:r>
+      </w:hyperlink>
+      <w:r>
+        <w:rPr>
+          <w:rFonts w:ascii="Times New Roman" w:hAnsi="Times New Roman" w:cs="Times New Roman"/>
+          <w:sz w:val="24"/>
+          <w:szCs w:val="24"/>
+        </w:rPr>
+        <w:t>]</w:t>
+      </w:r>
+      <w:r>
+        <w:rPr>
+          <w:rFonts w:ascii="Times New Roman" w:hAnsi="Times New Roman" w:cs="Times New Roman"/>
+          <w:sz w:val="24"/>
+          <w:szCs w:val="24"/>
+        </w:rPr>
+        <w:tab/>
+      </w:r>
+      <w:r>
+        <w:rPr>
+          <w:rFonts w:ascii="Times New Roman" w:hAnsi="Times New Roman" w:cs="Times New Roman"/>
+          <w:sz w:val="24"/>
+          <w:szCs w:val="24"/>
+        </w:rPr>
+        <w:t>2026</w:t>
+      </w:r>
+    </w:p>
+    <w:p>
+      <w:pPr>
+        <w:tabs>
+          <w:tab w:val="right" w:pos="9360"/>
+        </w:tabs>
+        <w:autoSpaceDE w:val="0"/>
+        <w:autoSpaceDN w:val="0"/>
+        <w:adjustRightInd w:val="0"/>
+        <w:spacing w:after="0" w:line="240" w:lineRule="auto"/>
+        <w:rPr>
+          <w:rFonts w:ascii="Times New Roman" w:hAnsi="Times New Roman" w:cs="Times New Roman"/>
+          <w:sz w:val="24"/>
+          <w:szCs w:val="24"/>
+        </w:rPr>
+      </w:pPr>
+      <w:r>
+        <w:rPr>
+          <w:rFonts w:ascii="Times New Roman" w:hAnsi="Times New Roman" w:cs="Times New Roman"/>
+          <w:sz w:val="24"/>
+          <w:szCs w:val="24"/>
+        </w:rPr>
+        <w:t xml:space="preserve">MIT, Algorithms Coffee                                                                                                           </w:t>
+      </w:r>
+      <w:r>
+        <w:rPr>
+          <w:rFonts w:ascii="Times New Roman" w:hAnsi="Times New Roman" w:cs="Times New Roman"/>
+          <w:sz w:val="24"/>
+          <w:szCs w:val="24"/>
+        </w:rPr>
+        <w:tab/>
+        <w:t>2026</w:t>
+      </w:r>
+    </w:p>
+    <w:p>
+      <w:pPr>
+        <w:tabs>
+          <w:tab w:val="right" w:pos="9360"/>
+        </w:tabs>
+        <w:autoSpaceDE w:val="0"/>
+        <w:autoSpaceDN w:val="0"/>
+        <w:adjustRightInd w:val="0"/>
+        <w:spacing w:after="0" w:line="240" w:lineRule="auto"/>
+        <w:rPr>
+          <w:rFonts w:ascii="Times New Roman" w:hAnsi="Times New Roman" w:cs="Times New Roman"/>
+          <w:sz w:val="24"/>
+          <w:szCs w:val="24"/>
+        </w:rPr>
+      </w:pPr>
+    </w:p>
+    <w:p>
+      <w:pPr>
+        <w:tabs>
+          <w:tab w:val="right" w:pos="9360"/>
+        </w:tabs>
+        <w:autoSpaceDE w:val="0"/>
+        <w:autoSpaceDN w:val="0"/>
+        <w:adjustRightInd w:val="0"/>
+        <w:spacing w:after="0" w:line="240" w:lineRule="auto"/>
+        <w:rPr>
+          <w:rFonts w:ascii="Times New Roman" w:hAnsi="Times New Roman" w:cs="Times New Roman"/>
+          <w:b/>
+          <w:bCs/>
+          <w:sz w:val="24"/>
+          <w:szCs w:val="24"/>
+        </w:rPr>
+      </w:pPr>
+      <w:r>
+        <w:rPr>
+          <w:rFonts w:ascii="Times New Roman" w:hAnsi="Times New Roman" w:cs="Times New Roman"/>
+          <w:b/>
+          <w:bCs/>
+          <w:sz w:val="24"/>
+          <w:szCs w:val="24"/>
+        </w:rPr>
+        <w:t>Evaluating multiple models using labeled and unlabeled data</w:t>
+      </w:r>
+    </w:p>
+    <w:p>
+      <w:pPr>
+        <w:tabs>
+          <w:tab w:val="right" w:pos="9360"/>
+        </w:tabs>
+        <w:autoSpaceDE w:val="0"/>
+        <w:autoSpaceDN w:val="0"/>
+        <w:adjustRightInd w:val="0"/>
+        <w:spacing w:after="0" w:line="240" w:lineRule="auto"/>
+        <w:rPr>
+          <w:rFonts w:ascii="Times New Roman" w:hAnsi="Times New Roman" w:cs="Times New Roman"/>
+          <w:sz w:val="24"/>
+          <w:szCs w:val="24"/>
+        </w:rPr>
+      </w:pPr>
+      <w:r>
+        <w:rPr>
+          <w:rFonts w:ascii="Times New Roman" w:hAnsi="Times New Roman" w:cs="Times New Roman"/>
+          <w:sz w:val="24"/>
+          <w:szCs w:val="24"/>
+        </w:rPr>
+        <w:t>MIT, Machine Learning Tea</w:t>
+      </w:r>
+      <w:r>
+        <w:rPr>
+          <w:rFonts w:ascii="Times New Roman" w:hAnsi="Times New Roman" w:cs="Times New Roman"/>
+          <w:sz w:val="24"/>
+          <w:szCs w:val="24"/>
+        </w:rPr>
+        <w:tab/>
+        <w:t>2025</w:t>
+      </w:r>
+    </w:p>
+    <w:p>
+      <w:pPr>
+        <w:tabs>
+          <w:tab w:val="right" w:pos="9360"/>
+        </w:tabs>
+        <w:autoSpaceDE w:val="0"/>
+        <w:autoSpaceDN w:val="0"/>
+        <w:adjustRightInd w:val="0"/>
+        <w:spacing w:after="0" w:line="240" w:lineRule="auto"/>
+        <w:rPr>
+          <w:rFonts w:ascii="Times New Roman" w:hAnsi="Times New Roman" w:cs="Times New Roman"/>
+          <w:sz w:val="24"/>
+          <w:szCs w:val="24"/>
+        </w:rPr>
+      </w:pPr>
+    </w:p>
+    <w:p>
+      <w:pPr>
+        <w:tabs>
+          <w:tab w:val="right" w:pos="9360"/>
+        </w:tabs>
+        <w:autoSpaceDE w:val="0"/>
+        <w:autoSpaceDN w:val="0"/>
+        <w:adjustRightInd w:val="0"/>
+        <w:spacing w:after="0" w:line="240" w:lineRule="auto"/>
+        <w:rPr>
+          <w:rFonts w:ascii="Times New Roman" w:hAnsi="Times New Roman" w:cs="Times New Roman"/>
+          <w:sz w:val="24"/>
+          <w:szCs w:val="24"/>
+        </w:rPr>
+      </w:pPr>
+      <w:r>
+        <w:rPr>
+          <w:rFonts w:ascii="Times New Roman" w:hAnsi="Times New Roman" w:cs="Times New Roman"/>
+          <w:b/>
+          <w:bCs/>
+          <w:sz w:val="24"/>
+          <w:szCs w:val="24"/>
+        </w:rPr>
+        <w:t>Assessing transcriptomic reidentification risks</w:t>
+      </w:r>
+      <w:r>
+        <w:rPr>
+          <w:rFonts w:ascii="Times New Roman" w:hAnsi="Times New Roman" w:cs="Times New Roman"/>
+          <w:b/>
+          <w:bCs/>
+          <w:sz w:val="24"/>
+          <w:szCs w:val="24"/>
+        </w:rPr>
+        <w:tab/>
+      </w:r>
+    </w:p>
+    <w:p>
+      <w:pPr>
+        <w:tabs>
+          <w:tab w:val="right" w:pos="9360"/>
+        </w:tabs>
+        <w:autoSpaceDE w:val="0"/>
+        <w:autoSpaceDN w:val="0"/>
+        <w:adjustRightInd w:val="0"/>
+        <w:spacing w:after="0" w:line="240" w:lineRule="auto"/>
+        <w:rPr>
+          <w:rFonts w:ascii="Times New Roman" w:hAnsi="Times New Roman" w:cs="Times New Roman"/>
+          <w:sz w:val="24"/>
+          <w:szCs w:val="24"/>
+        </w:rPr>
+      </w:pPr>
+      <w:r>
+        <w:rPr>
+          <w:rFonts w:ascii="Times New Roman" w:hAnsi="Times New Roman" w:cs="Times New Roman"/>
+          <w:sz w:val="24"/>
+          <w:szCs w:val="24"/>
+        </w:rPr>
+        <w:t>RECOMB</w:t>
+      </w:r>
+      <w:r>
+        <w:rPr>
+          <w:rFonts w:ascii="Times New Roman" w:hAnsi="Times New Roman" w:cs="Times New Roman"/>
+          <w:sz w:val="24"/>
+          <w:szCs w:val="24"/>
+        </w:rPr>
+        <w:t>, Oral Presentation</w:t>
+      </w:r>
+      <w:r>
+        <w:rPr>
+          <w:rFonts w:ascii="Times New Roman" w:hAnsi="Times New Roman" w:cs="Times New Roman"/>
+          <w:sz w:val="24"/>
+          <w:szCs w:val="24"/>
+        </w:rPr>
+        <w:t xml:space="preserve"> [</w:t>
+      </w:r>
+      <w:hyperlink r:id="rId14" w:history="1">
+        <w:r>
+          <w:rPr>
+            <w:rStyle w:val="Hyperlink"/>
+            <w:rFonts w:ascii="Times New Roman" w:hAnsi="Times New Roman" w:cs="Times New Roman"/>
+            <w:sz w:val="24"/>
+            <w:szCs w:val="24"/>
+          </w:rPr>
+          <w:t>YouTube</w:t>
+        </w:r>
+      </w:hyperlink>
+      <w:r>
+        <w:rPr>
+          <w:rFonts w:ascii="Times New Roman" w:hAnsi="Times New Roman" w:cs="Times New Roman"/>
+          <w:sz w:val="24"/>
+          <w:szCs w:val="24"/>
+        </w:rPr>
+        <w:t>]</w:t>
+      </w:r>
+      <w:r>
+        <w:rPr>
+          <w:rFonts w:ascii="Times New Roman" w:hAnsi="Times New Roman" w:cs="Times New Roman"/>
+          <w:sz w:val="24"/>
+          <w:szCs w:val="24"/>
+        </w:rPr>
+        <w:tab/>
+        <w:t>202</w:t>
+      </w:r>
+      <w:r>
+        <w:rPr>
+          <w:rFonts w:ascii="Times New Roman" w:hAnsi="Times New Roman" w:cs="Times New Roman"/>
+          <w:sz w:val="24"/>
+          <w:szCs w:val="24"/>
+        </w:rPr>
+        <w:t>4</w:t>
+      </w:r>
+    </w:p>
+    <w:p>
+      <w:pPr>
+        <w:pBdr>
+          <w:bottom w:val="single" w:sz="4" w:space="1" w:color="auto"/>
+        </w:pBdr>
         <w:spacing w:after="60"/>
         <w:rPr>
           <w:rFonts w:ascii="Times New Roman" w:hAnsi="Times New Roman" w:cs="Times New Roman"/>
@@ -2456,7 +3047,25 @@
           <w:sz w:val="24"/>
           <w:szCs w:val="24"/>
         </w:rPr>
-        <w:t>(Prof. Michael Mitzenmacher)</w:t>
+        <w:t xml:space="preserve">(Prof. Michael </w:t>
+      </w:r>
+      <w:proofErr w:type="spellStart"/>
+      <w:r>
+        <w:rPr>
+          <w:rFonts w:ascii="Times New Roman" w:hAnsi="Times New Roman" w:cs="Times New Roman"/>
+          <w:sz w:val="24"/>
+          <w:szCs w:val="24"/>
+        </w:rPr>
+        <w:t>Mitzenmacher</w:t>
+      </w:r>
+      <w:proofErr w:type="spellEnd"/>
+      <w:r>
+        <w:rPr>
+          <w:rFonts w:ascii="Times New Roman" w:hAnsi="Times New Roman" w:cs="Times New Roman"/>
+          <w:sz w:val="24"/>
+          <w:szCs w:val="24"/>
+        </w:rPr>
+        <w:t>)</w:t>
       </w:r>
       <w:r>
         <w:rPr>
@@ -2650,23 +3259,6 @@
         </w:rPr>
         <w:t>Fall 2019</w:t>
       </w:r>
-    </w:p>
-    <w:p>
-      <w:pPr>
-        <w:pBdr>
-          <w:bottom w:val="single" w:sz="4" w:space="1" w:color="auto"/>
-        </w:pBdr>
-        <w:tabs>
-          <w:tab w:val="right" w:pos="9360"/>
-        </w:tabs>
-        <w:spacing w:after="60"/>
-        <w:rPr>
-          <w:rFonts w:ascii="Times New Roman" w:hAnsi="Times New Roman" w:cs="Times New Roman"/>
-          <w:b/>
-          <w:sz w:val="24"/>
-          <w:szCs w:val="24"/>
-        </w:rPr>
-      </w:pPr>
     </w:p>
     <w:p>
       <w:pPr>
@@ -2681,122 +3273,6 @@
           <w:szCs w:val="24"/>
         </w:rPr>
       </w:pPr>
-      <w:r>
-        <w:rPr>
-          <w:rFonts w:ascii="Times New Roman" w:hAnsi="Times New Roman" w:cs="Times New Roman"/>
-          <w:b/>
-          <w:sz w:val="24"/>
-          <w:szCs w:val="24"/>
-        </w:rPr>
-        <w:t>REVIEWING AND SERVICE</w:t>
-      </w:r>
-      <w:r>
-        <w:rPr>
-          <w:rFonts w:ascii="Times New Roman" w:hAnsi="Times New Roman" w:cs="Times New Roman"/>
-          <w:b/>
-          <w:sz w:val="24"/>
-          <w:szCs w:val="24"/>
-        </w:rPr>
-        <w:tab/>
-      </w:r>
-    </w:p>
-    <w:p>
-      <w:pPr>
-        <w:tabs>
-          <w:tab w:val="right" w:pos="9360"/>
-        </w:tabs>
-        <w:autoSpaceDE w:val="0"/>
-        <w:autoSpaceDN w:val="0"/>
-        <w:adjustRightInd w:val="0"/>
-        <w:spacing w:after="0" w:line="240" w:lineRule="auto"/>
-        <w:rPr>
-          <w:rFonts w:ascii="Times New Roman" w:hAnsi="Times New Roman" w:cs="Times New Roman"/>
-          <w:sz w:val="24"/>
-          <w:szCs w:val="24"/>
-        </w:rPr>
-      </w:pPr>
-      <w:r>
-        <w:rPr>
-          <w:rFonts w:ascii="Times New Roman" w:hAnsi="Times New Roman" w:cs="Times New Roman"/>
-          <w:sz w:val="24"/>
-          <w:szCs w:val="24"/>
-        </w:rPr>
-        <w:t>Roundtable Chair, ML4H 2024</w:t>
-      </w:r>
-      <w:r>
-        <w:rPr>
-          <w:rFonts w:ascii="Times New Roman" w:hAnsi="Times New Roman" w:cs="Times New Roman"/>
-          <w:sz w:val="24"/>
-          <w:szCs w:val="24"/>
-        </w:rPr>
-        <w:t>, 2025</w:t>
-      </w:r>
-      <w:r>
-        <w:rPr>
-          <w:rFonts w:ascii="Times New Roman" w:hAnsi="Times New Roman" w:cs="Times New Roman"/>
-          <w:sz w:val="24"/>
-          <w:szCs w:val="24"/>
-        </w:rPr>
-        <w:tab/>
-        <w:t>2024</w:t>
-      </w:r>
-      <w:r>
-        <w:rPr>
-          <w:rFonts w:ascii="Times New Roman" w:hAnsi="Times New Roman" w:cs="Times New Roman"/>
-          <w:sz w:val="24"/>
-          <w:szCs w:val="24"/>
-        </w:rPr>
-        <w:t>, 2025</w:t>
-      </w:r>
-    </w:p>
-    <w:p>
-      <w:pPr>
-        <w:tabs>
-          <w:tab w:val="right" w:pos="9360"/>
-        </w:tabs>
-        <w:autoSpaceDE w:val="0"/>
-        <w:autoSpaceDN w:val="0"/>
-        <w:adjustRightInd w:val="0"/>
-        <w:spacing w:after="0" w:line="240" w:lineRule="auto"/>
-        <w:rPr>
-          <w:rFonts w:ascii="Times New Roman" w:hAnsi="Times New Roman" w:cs="Times New Roman"/>
-          <w:sz w:val="24"/>
-          <w:szCs w:val="24"/>
-        </w:rPr>
-      </w:pPr>
-      <w:r>
-        <w:rPr>
-          <w:rFonts w:ascii="Times New Roman" w:hAnsi="Times New Roman" w:cs="Times New Roman"/>
-          <w:sz w:val="24"/>
-          <w:szCs w:val="24"/>
-        </w:rPr>
-        <w:t>Member, NIST AI Safety Institute Task Force on Red Teaming                                              2024</w:t>
-      </w:r>
-    </w:p>
-    <w:p>
-      <w:pPr>
-        <w:tabs>
-          <w:tab w:val="right" w:pos="9360"/>
-        </w:tabs>
-        <w:autoSpaceDE w:val="0"/>
-        <w:autoSpaceDN w:val="0"/>
-        <w:adjustRightInd w:val="0"/>
-        <w:spacing w:after="0" w:line="240" w:lineRule="auto"/>
-        <w:jc w:val="center"/>
-        <w:rPr>
-          <w:rFonts w:ascii="Times New Roman" w:hAnsi="Times New Roman" w:cs="Times New Roman"/>
-          <w:sz w:val="24"/>
-          <w:szCs w:val="24"/>
-        </w:rPr>
-      </w:pPr>
-      <w:r>
-        <w:rPr>
-          <w:rFonts w:ascii="Times New Roman" w:hAnsi="Times New Roman" w:cs="Times New Roman"/>
-          <w:sz w:val="24"/>
-          <w:szCs w:val="24"/>
-        </w:rPr>
-        <w:t>Planning Committee, Hertz Foundation Summer Workshop                                                    2023</w:t>
-      </w:r>
     </w:p>
     <w:p>
       <w:pPr>
@@ -2806,17 +3282,181 @@
         <w:spacing w:after="60"/>
         <w:rPr>
           <w:rFonts w:ascii="Times New Roman" w:hAnsi="Times New Roman" w:cs="Times New Roman"/>
-          <w:sz w:val="24"/>
-          <w:szCs w:val="24"/>
-        </w:rPr>
-      </w:pPr>
-      <w:r>
-        <w:rPr>
-          <w:rFonts w:ascii="Times New Roman" w:hAnsi="Times New Roman" w:cs="Times New Roman"/>
-          <w:sz w:val="24"/>
-          <w:szCs w:val="24"/>
-        </w:rPr>
-        <w:t xml:space="preserve">Reviewing: NeurIPS, ICLR, ICLR MLGenX workshop, Journal of Computational Biology, </w:t>
+          <w:b/>
+          <w:sz w:val="24"/>
+          <w:szCs w:val="24"/>
+        </w:rPr>
+      </w:pPr>
+      <w:r>
+        <w:rPr>
+          <w:rFonts w:ascii="Times New Roman" w:hAnsi="Times New Roman" w:cs="Times New Roman"/>
+          <w:b/>
+          <w:sz w:val="24"/>
+          <w:szCs w:val="24"/>
+        </w:rPr>
+        <w:t>REVIEWING AND SERVICE</w:t>
+      </w:r>
+      <w:r>
+        <w:rPr>
+          <w:rFonts w:ascii="Times New Roman" w:hAnsi="Times New Roman" w:cs="Times New Roman"/>
+          <w:b/>
+          <w:sz w:val="24"/>
+          <w:szCs w:val="24"/>
+        </w:rPr>
+        <w:tab/>
+      </w:r>
+    </w:p>
+    <w:p>
+      <w:pPr>
+        <w:tabs>
+          <w:tab w:val="right" w:pos="9360"/>
+        </w:tabs>
+        <w:autoSpaceDE w:val="0"/>
+        <w:autoSpaceDN w:val="0"/>
+        <w:adjustRightInd w:val="0"/>
+        <w:spacing w:after="0" w:line="240" w:lineRule="auto"/>
+        <w:rPr>
+          <w:rFonts w:ascii="Times New Roman" w:hAnsi="Times New Roman" w:cs="Times New Roman"/>
+          <w:sz w:val="24"/>
+          <w:szCs w:val="24"/>
+        </w:rPr>
+      </w:pPr>
+      <w:r>
+        <w:rPr>
+          <w:rFonts w:ascii="Times New Roman" w:hAnsi="Times New Roman" w:cs="Times New Roman"/>
+          <w:sz w:val="24"/>
+          <w:szCs w:val="24"/>
+        </w:rPr>
+        <w:t>Roundtable Chair, ML4H 2024</w:t>
+      </w:r>
+      <w:r>
+        <w:rPr>
+          <w:rFonts w:ascii="Times New Roman" w:hAnsi="Times New Roman" w:cs="Times New Roman"/>
+          <w:sz w:val="24"/>
+          <w:szCs w:val="24"/>
+        </w:rPr>
+        <w:t>, 2025</w:t>
+      </w:r>
+      <w:r>
+        <w:rPr>
+          <w:rFonts w:ascii="Times New Roman" w:hAnsi="Times New Roman" w:cs="Times New Roman"/>
+          <w:sz w:val="24"/>
+          <w:szCs w:val="24"/>
+        </w:rPr>
+        <w:tab/>
+        <w:t>2024</w:t>
+      </w:r>
+      <w:r>
+        <w:rPr>
+          <w:rFonts w:ascii="Times New Roman" w:hAnsi="Times New Roman" w:cs="Times New Roman"/>
+          <w:sz w:val="24"/>
+          <w:szCs w:val="24"/>
+        </w:rPr>
+        <w:t>, 2025</w:t>
+      </w:r>
+    </w:p>
+    <w:p>
+      <w:pPr>
+        <w:tabs>
+          <w:tab w:val="right" w:pos="9360"/>
+        </w:tabs>
+        <w:autoSpaceDE w:val="0"/>
+        <w:autoSpaceDN w:val="0"/>
+        <w:adjustRightInd w:val="0"/>
+        <w:spacing w:after="0" w:line="240" w:lineRule="auto"/>
+        <w:rPr>
+          <w:rFonts w:ascii="Times New Roman" w:hAnsi="Times New Roman" w:cs="Times New Roman"/>
+          <w:sz w:val="24"/>
+          <w:szCs w:val="24"/>
+        </w:rPr>
+      </w:pPr>
+      <w:r>
+        <w:rPr>
+          <w:rFonts w:ascii="Times New Roman" w:hAnsi="Times New Roman" w:cs="Times New Roman"/>
+          <w:sz w:val="24"/>
+          <w:szCs w:val="24"/>
+        </w:rPr>
+        <w:t>Member, NIST AI Safety Institute Task Force on Red Teaming                                              2024</w:t>
+      </w:r>
+    </w:p>
+    <w:p>
+      <w:pPr>
+        <w:tabs>
+          <w:tab w:val="right" w:pos="9360"/>
+        </w:tabs>
+        <w:autoSpaceDE w:val="0"/>
+        <w:autoSpaceDN w:val="0"/>
+        <w:adjustRightInd w:val="0"/>
+        <w:spacing w:after="0" w:line="240" w:lineRule="auto"/>
+        <w:jc w:val="center"/>
+        <w:rPr>
+          <w:rFonts w:ascii="Times New Roman" w:hAnsi="Times New Roman" w:cs="Times New Roman"/>
+          <w:sz w:val="24"/>
+          <w:szCs w:val="24"/>
+        </w:rPr>
+      </w:pPr>
+      <w:r>
+        <w:rPr>
+          <w:rFonts w:ascii="Times New Roman" w:hAnsi="Times New Roman" w:cs="Times New Roman"/>
+          <w:sz w:val="24"/>
+          <w:szCs w:val="24"/>
+        </w:rPr>
+        <w:t>Planning Committee, Hertz Foundation Summer Workshop                                                    2023</w:t>
+      </w:r>
+    </w:p>
+    <w:p>
+      <w:pPr>
+        <w:pBdr>
+          <w:bottom w:val="single" w:sz="4" w:space="1" w:color="auto"/>
+        </w:pBdr>
+        <w:spacing w:after="60"/>
+        <w:rPr>
+          <w:rFonts w:ascii="Times New Roman" w:hAnsi="Times New Roman" w:cs="Times New Roman"/>
+          <w:sz w:val="24"/>
+          <w:szCs w:val="24"/>
+        </w:rPr>
+      </w:pPr>
+      <w:r>
+        <w:rPr>
+          <w:rFonts w:ascii="Times New Roman" w:hAnsi="Times New Roman" w:cs="Times New Roman"/>
+          <w:sz w:val="24"/>
+          <w:szCs w:val="24"/>
+        </w:rPr>
+        <w:t xml:space="preserve">Reviewing: </w:t>
+      </w:r>
+      <w:proofErr w:type="spellStart"/>
+      <w:r>
+        <w:rPr>
+          <w:rFonts w:ascii="Times New Roman" w:hAnsi="Times New Roman" w:cs="Times New Roman"/>
+          <w:sz w:val="24"/>
+          <w:szCs w:val="24"/>
+        </w:rPr>
+        <w:t>NeurIPS</w:t>
+      </w:r>
+      <w:proofErr w:type="spellEnd"/>
+      <w:r>
+        <w:rPr>
+          <w:rFonts w:ascii="Times New Roman" w:hAnsi="Times New Roman" w:cs="Times New Roman"/>
+          <w:sz w:val="24"/>
+          <w:szCs w:val="24"/>
+        </w:rPr>
+        <w:t xml:space="preserve">, </w:t>
+      </w:r>
+      <w:r>
+        <w:rPr>
+          <w:rFonts w:ascii="Times New Roman" w:hAnsi="Times New Roman" w:cs="Times New Roman"/>
+          <w:sz w:val="24"/>
+          <w:szCs w:val="24"/>
+        </w:rPr>
+        <w:t xml:space="preserve">ICML, </w:t>
+      </w:r>
+      <w:r>
+        <w:rPr>
+          <w:rFonts w:ascii="Times New Roman" w:hAnsi="Times New Roman" w:cs="Times New Roman"/>
+          <w:sz w:val="24"/>
+          <w:szCs w:val="24"/>
+        </w:rPr>
+        <w:t xml:space="preserve">ICLR, Journal of Computational Biology, </w:t>
       </w:r>
       <w:r>
         <w:rPr>
@@ -3013,6 +3653,7 @@
           <w:sz w:val="24"/>
           <w:szCs w:val="24"/>
         </w:rPr>
+        <w:lastRenderedPageBreak/>
         <w:t>Non-Resident Tutor, Mather House (Harvard University)</w:t>
       </w:r>
       <w:r>
@@ -3297,16 +3938,25 @@
           <w:sz w:val="24"/>
           <w:szCs w:val="24"/>
         </w:rPr>
-        <w:t xml:space="preserve">Genentech                                                                                                           </w:t>
-      </w:r>
-      <w:r>
-        <w:rPr>
-          <w:rFonts w:ascii="Times New Roman" w:hAnsi="Times New Roman" w:cs="Times New Roman"/>
-          <w:bCs/>
-          <w:sz w:val="24"/>
-          <w:szCs w:val="24"/>
-        </w:rPr>
-        <w:t>San Francisco, CA</w:t>
+        <w:t>Abridge</w:t>
+      </w:r>
+      <w:r>
+        <w:rPr>
+          <w:rFonts w:ascii="Times New Roman" w:hAnsi="Times New Roman" w:cs="Times New Roman"/>
+          <w:b/>
+          <w:sz w:val="24"/>
+          <w:szCs w:val="24"/>
+        </w:rPr>
+        <w:tab/>
+      </w:r>
+      <w:r>
+        <w:rPr>
+          <w:rFonts w:ascii="Times New Roman" w:hAnsi="Times New Roman" w:cs="Times New Roman"/>
+          <w:bCs/>
+          <w:sz w:val="24"/>
+          <w:szCs w:val="24"/>
+        </w:rPr>
+        <w:t>New York, NY</w:t>
       </w:r>
     </w:p>
     <w:p>
@@ -3334,8 +3984,7 @@
           <w:sz w:val="24"/>
           <w:szCs w:val="24"/>
         </w:rPr>
-        <w:lastRenderedPageBreak/>
-        <w:t>ML Research Inter</w:t>
+        <w:t>PhD Research Intern</w:t>
       </w:r>
       <w:r>
         <w:rPr>
@@ -3346,8 +3995,132 @@
           <w:sz w:val="24"/>
           <w:szCs w:val="24"/>
         </w:rPr>
-        <w:t xml:space="preserve">n                            </w:t>
-      </w:r>
+        <w:tab/>
+      </w:r>
+      <w:r>
+        <w:rPr>
+          <w:rFonts w:ascii="Times New Roman" w:hAnsi="Times New Roman" w:cs="Times New Roman"/>
+          <w:bCs/>
+          <w:sz w:val="24"/>
+          <w:szCs w:val="24"/>
+        </w:rPr>
+        <w:t>2026</w:t>
+      </w:r>
+    </w:p>
+    <w:p>
+      <w:pPr>
+        <w:tabs>
+          <w:tab w:val="right" w:pos="9360"/>
+        </w:tabs>
+        <w:autoSpaceDE w:val="0"/>
+        <w:autoSpaceDN w:val="0"/>
+        <w:adjustRightInd w:val="0"/>
+        <w:spacing w:after="0" w:line="240" w:lineRule="auto"/>
+        <w:rPr>
+          <w:rFonts w:ascii="Times New Roman" w:hAnsi="Times New Roman" w:cs="Times New Roman"/>
+          <w:bCs/>
+          <w:sz w:val="24"/>
+          <w:szCs w:val="24"/>
+        </w:rPr>
+      </w:pPr>
+      <w:r>
+        <w:rPr>
+          <w:rFonts w:ascii="Times New Roman" w:hAnsi="Times New Roman" w:cs="Times New Roman"/>
+          <w:bCs/>
+          <w:sz w:val="24"/>
+          <w:szCs w:val="24"/>
+        </w:rPr>
+        <w:t xml:space="preserve">Mentors: Alex </w:t>
+      </w:r>
+      <w:proofErr w:type="spellStart"/>
+      <w:r>
+        <w:rPr>
+          <w:rFonts w:ascii="Times New Roman" w:hAnsi="Times New Roman" w:cs="Times New Roman"/>
+          <w:bCs/>
+          <w:sz w:val="24"/>
+          <w:szCs w:val="24"/>
+        </w:rPr>
+        <w:t>Chouldechova</w:t>
+      </w:r>
+      <w:proofErr w:type="spellEnd"/>
+      <w:r>
+        <w:rPr>
+          <w:rFonts w:ascii="Times New Roman" w:hAnsi="Times New Roman" w:cs="Times New Roman"/>
+          <w:bCs/>
+          <w:sz w:val="24"/>
+          <w:szCs w:val="24"/>
+        </w:rPr>
+        <w:t>, Michael Oberst</w:t>
+      </w:r>
+    </w:p>
+    <w:p>
+      <w:pPr>
+        <w:tabs>
+          <w:tab w:val="right" w:pos="9360"/>
+        </w:tabs>
+        <w:autoSpaceDE w:val="0"/>
+        <w:autoSpaceDN w:val="0"/>
+        <w:adjustRightInd w:val="0"/>
+        <w:spacing w:after="0" w:line="240" w:lineRule="auto"/>
+        <w:rPr>
+          <w:rFonts w:ascii="Times New Roman" w:hAnsi="Times New Roman" w:cs="Times New Roman"/>
+          <w:bCs/>
+          <w:sz w:val="24"/>
+          <w:szCs w:val="24"/>
+        </w:rPr>
+      </w:pPr>
+    </w:p>
+    <w:p>
+      <w:pPr>
+        <w:tabs>
+          <w:tab w:val="right" w:pos="9360"/>
+        </w:tabs>
+        <w:autoSpaceDE w:val="0"/>
+        <w:autoSpaceDN w:val="0"/>
+        <w:adjustRightInd w:val="0"/>
+        <w:spacing w:after="0" w:line="240" w:lineRule="auto"/>
+        <w:rPr>
+          <w:rFonts w:ascii="Times New Roman" w:hAnsi="Times New Roman" w:cs="Times New Roman"/>
+          <w:bCs/>
+          <w:sz w:val="24"/>
+          <w:szCs w:val="24"/>
+        </w:rPr>
+      </w:pPr>
+      <w:r>
+        <w:rPr>
+          <w:rFonts w:ascii="Times New Roman" w:hAnsi="Times New Roman" w:cs="Times New Roman"/>
+          <w:b/>
+          <w:sz w:val="24"/>
+          <w:szCs w:val="24"/>
+        </w:rPr>
+        <w:t xml:space="preserve">Genentech                                                                                                           </w:t>
+      </w:r>
+      <w:r>
+        <w:rPr>
+          <w:rFonts w:ascii="Times New Roman" w:hAnsi="Times New Roman" w:cs="Times New Roman"/>
+          <w:bCs/>
+          <w:sz w:val="24"/>
+          <w:szCs w:val="24"/>
+        </w:rPr>
+        <w:t>San Francisco, CA</w:t>
+      </w:r>
+    </w:p>
+    <w:p>
+      <w:pPr>
+        <w:tabs>
+          <w:tab w:val="right" w:pos="9360"/>
+        </w:tabs>
+        <w:autoSpaceDE w:val="0"/>
+        <w:autoSpaceDN w:val="0"/>
+        <w:adjustRightInd w:val="0"/>
+        <w:spacing w:after="0" w:line="240" w:lineRule="auto"/>
+        <w:rPr>
+          <w:rFonts w:ascii="Times New Roman" w:hAnsi="Times New Roman" w:cs="Times New Roman"/>
+          <w:bCs/>
+          <w:sz w:val="24"/>
+          <w:szCs w:val="24"/>
+        </w:rPr>
+      </w:pPr>
       <w:r>
         <w:rPr>
           <w:rFonts w:ascii="Times New Roman" w:hAnsi="Times New Roman" w:cs="Times New Roman"/>
@@ -3357,6 +4130,28 @@
           <w:sz w:val="24"/>
           <w:szCs w:val="24"/>
         </w:rPr>
+        <w:t>ML Research Inter</w:t>
+      </w:r>
+      <w:r>
+        <w:rPr>
+          <w:rFonts w:ascii="Times New Roman" w:hAnsi="Times New Roman" w:cs="Times New Roman"/>
+          <w:bCs/>
+          <w:i/>
+          <w:iCs/>
+          <w:sz w:val="24"/>
+          <w:szCs w:val="24"/>
+        </w:rPr>
+        <w:t xml:space="preserve">n                            </w:t>
+      </w:r>
+      <w:r>
+        <w:rPr>
+          <w:rFonts w:ascii="Times New Roman" w:hAnsi="Times New Roman" w:cs="Times New Roman"/>
+          <w:bCs/>
+          <w:i/>
+          <w:iCs/>
+          <w:sz w:val="24"/>
+          <w:szCs w:val="24"/>
+        </w:rPr>
         <w:t xml:space="preserve">                                                                                       </w:t>
       </w:r>
       <w:r>
@@ -3367,6 +4162,52 @@
           <w:szCs w:val="24"/>
         </w:rPr>
         <w:t>2025</w:t>
+      </w:r>
+    </w:p>
+    <w:p>
+      <w:pPr>
+        <w:tabs>
+          <w:tab w:val="right" w:pos="9360"/>
+        </w:tabs>
+        <w:autoSpaceDE w:val="0"/>
+        <w:autoSpaceDN w:val="0"/>
+        <w:adjustRightInd w:val="0"/>
+        <w:spacing w:after="0" w:line="240" w:lineRule="auto"/>
+        <w:rPr>
+          <w:rFonts w:ascii="Times New Roman" w:hAnsi="Times New Roman" w:cs="Times New Roman"/>
+          <w:bCs/>
+          <w:sz w:val="24"/>
+          <w:szCs w:val="24"/>
+        </w:rPr>
+      </w:pPr>
+      <w:r>
+        <w:rPr>
+          <w:rFonts w:ascii="Times New Roman" w:hAnsi="Times New Roman" w:cs="Times New Roman"/>
+          <w:bCs/>
+          <w:sz w:val="24"/>
+          <w:szCs w:val="24"/>
+        </w:rPr>
+        <w:t xml:space="preserve">Mentors: </w:t>
+      </w:r>
+      <w:proofErr w:type="spellStart"/>
+      <w:r>
+        <w:rPr>
+          <w:rFonts w:ascii="Times New Roman" w:hAnsi="Times New Roman" w:cs="Times New Roman"/>
+          <w:bCs/>
+          <w:sz w:val="24"/>
+          <w:szCs w:val="24"/>
+        </w:rPr>
+        <w:t>Hanchen</w:t>
+      </w:r>
+      <w:proofErr w:type="spellEnd"/>
+      <w:r>
+        <w:rPr>
+          <w:rFonts w:ascii="Times New Roman" w:hAnsi="Times New Roman" w:cs="Times New Roman"/>
+          <w:bCs/>
+          <w:sz w:val="24"/>
+          <w:szCs w:val="24"/>
+        </w:rPr>
+        <w:t xml:space="preserve"> Wang, Aviv Regev</w:t>
       </w:r>
     </w:p>
     <w:p>
@@ -3673,7 +4514,7 @@
           <w:szCs w:val="24"/>
         </w:rPr>
       </w:pPr>
-      <w:hyperlink r:id="rId14" w:history="1">
+      <w:hyperlink r:id="rId15" w:history="1">
         <w:r>
           <w:rPr>
             <w:rStyle w:val="Hyperlink"/>
@@ -3684,114 +4525,6 @@
           <w:t>bab@csail.mit.edu</w:t>
         </w:r>
       </w:hyperlink>
-    </w:p>
-    <w:p>
-      <w:pPr>
-        <w:autoSpaceDE w:val="0"/>
-        <w:autoSpaceDN w:val="0"/>
-        <w:adjustRightInd w:val="0"/>
-        <w:spacing w:after="0" w:line="240" w:lineRule="auto"/>
-        <w:rPr>
-          <w:rFonts w:ascii="Times New Roman" w:hAnsi="Times New Roman" w:cs="Times New Roman"/>
-          <w:sz w:val="24"/>
-          <w:szCs w:val="24"/>
-        </w:rPr>
-      </w:pPr>
-    </w:p>
-    <w:p>
-      <w:pPr>
-        <w:autoSpaceDE w:val="0"/>
-        <w:autoSpaceDN w:val="0"/>
-        <w:adjustRightInd w:val="0"/>
-        <w:spacing w:after="0" w:line="240" w:lineRule="auto"/>
-        <w:rPr>
-          <w:rFonts w:ascii="Times New Roman" w:hAnsi="Times New Roman" w:cs="Times New Roman"/>
-          <w:sz w:val="24"/>
-          <w:szCs w:val="24"/>
-        </w:rPr>
-      </w:pPr>
-      <w:r>
-        <w:rPr>
-          <w:rFonts w:ascii="Times New Roman" w:hAnsi="Times New Roman" w:cs="Times New Roman"/>
-          <w:sz w:val="24"/>
-          <w:szCs w:val="24"/>
-        </w:rPr>
-        <w:t>Emma Pierson</w:t>
-      </w:r>
-    </w:p>
-    <w:p>
-      <w:pPr>
-        <w:autoSpaceDE w:val="0"/>
-        <w:autoSpaceDN w:val="0"/>
-        <w:adjustRightInd w:val="0"/>
-        <w:spacing w:after="0" w:line="240" w:lineRule="auto"/>
-        <w:rPr>
-          <w:rFonts w:ascii="Times New Roman" w:hAnsi="Times New Roman" w:cs="Times New Roman"/>
-          <w:sz w:val="24"/>
-          <w:szCs w:val="24"/>
-        </w:rPr>
-      </w:pPr>
-      <w:r>
-        <w:rPr>
-          <w:rFonts w:ascii="Times New Roman" w:hAnsi="Times New Roman" w:cs="Times New Roman"/>
-          <w:sz w:val="24"/>
-          <w:szCs w:val="24"/>
-        </w:rPr>
-        <w:t>University of California, Berkeley</w:t>
-      </w:r>
-    </w:p>
-    <w:p>
-      <w:pPr>
-        <w:autoSpaceDE w:val="0"/>
-        <w:autoSpaceDN w:val="0"/>
-        <w:adjustRightInd w:val="0"/>
-        <w:spacing w:after="0" w:line="240" w:lineRule="auto"/>
-        <w:rPr>
-          <w:rFonts w:ascii="Times New Roman" w:hAnsi="Times New Roman" w:cs="Times New Roman"/>
-          <w:sz w:val="24"/>
-          <w:szCs w:val="24"/>
-        </w:rPr>
-      </w:pPr>
-      <w:r>
-        <w:rPr>
-          <w:rFonts w:ascii="Times New Roman" w:hAnsi="Times New Roman" w:cs="Times New Roman"/>
-          <w:sz w:val="24"/>
-          <w:szCs w:val="24"/>
-        </w:rPr>
-        <w:t>Assistant Professor of Electrical Engineering and Computer Science</w:t>
-      </w:r>
-    </w:p>
-    <w:p>
-      <w:pPr>
-        <w:autoSpaceDE w:val="0"/>
-        <w:autoSpaceDN w:val="0"/>
-        <w:adjustRightInd w:val="0"/>
-        <w:spacing w:after="0" w:line="240" w:lineRule="auto"/>
-        <w:rPr>
-          <w:rFonts w:ascii="Times New Roman" w:hAnsi="Times New Roman" w:cs="Times New Roman"/>
-          <w:sz w:val="24"/>
-          <w:szCs w:val="24"/>
-        </w:rPr>
-      </w:pPr>
-      <w:hyperlink r:id="rId15" w:history="1">
-        <w:r>
-          <w:rPr>
-            <w:rStyle w:val="Hyperlink"/>
-            <w:rFonts w:ascii="Times New Roman" w:hAnsi="Times New Roman" w:cs="Times New Roman"/>
-            <w:sz w:val="24"/>
-            <w:szCs w:val="24"/>
-          </w:rPr>
-          <w:t>emma.pierson@berkeley.edu</w:t>
-        </w:r>
-      </w:hyperlink>
-      <w:r>
-        <w:rPr>
-          <w:rFonts w:ascii="Times New Roman" w:hAnsi="Times New Roman" w:cs="Times New Roman"/>
-          <w:sz w:val="24"/>
-          <w:szCs w:val="24"/>
-        </w:rPr>
-        <w:t xml:space="preserve"> </w:t>
-      </w:r>
     </w:p>
     <w:p>
       <w:pPr>
@@ -3921,6 +4654,127 @@
           <w:szCs w:val="24"/>
         </w:rPr>
       </w:pPr>
+      <w:r>
+        <w:rPr>
+          <w:rFonts w:ascii="Times New Roman" w:hAnsi="Times New Roman" w:cs="Times New Roman"/>
+          <w:sz w:val="24"/>
+          <w:szCs w:val="24"/>
+        </w:rPr>
+        <w:t>Emma Pierson</w:t>
+      </w:r>
+    </w:p>
+    <w:p>
+      <w:pPr>
+        <w:autoSpaceDE w:val="0"/>
+        <w:autoSpaceDN w:val="0"/>
+        <w:adjustRightInd w:val="0"/>
+        <w:spacing w:after="0" w:line="240" w:lineRule="auto"/>
+        <w:rPr>
+          <w:rFonts w:ascii="Times New Roman" w:hAnsi="Times New Roman" w:cs="Times New Roman"/>
+          <w:sz w:val="24"/>
+          <w:szCs w:val="24"/>
+        </w:rPr>
+      </w:pPr>
+      <w:r>
+        <w:rPr>
+          <w:rFonts w:ascii="Times New Roman" w:hAnsi="Times New Roman" w:cs="Times New Roman"/>
+          <w:sz w:val="24"/>
+          <w:szCs w:val="24"/>
+        </w:rPr>
+        <w:t>University of California, Berkeley</w:t>
+      </w:r>
+    </w:p>
+    <w:p>
+      <w:pPr>
+        <w:autoSpaceDE w:val="0"/>
+        <w:autoSpaceDN w:val="0"/>
+        <w:adjustRightInd w:val="0"/>
+        <w:spacing w:after="0" w:line="240" w:lineRule="auto"/>
+        <w:rPr>
+          <w:rFonts w:ascii="Times New Roman" w:hAnsi="Times New Roman" w:cs="Times New Roman"/>
+          <w:sz w:val="24"/>
+          <w:szCs w:val="24"/>
+        </w:rPr>
+      </w:pPr>
+      <w:r>
+        <w:rPr>
+          <w:rFonts w:ascii="Times New Roman" w:hAnsi="Times New Roman" w:cs="Times New Roman"/>
+          <w:sz w:val="24"/>
+          <w:szCs w:val="24"/>
+        </w:rPr>
+        <w:t>Assistant Professor of Electrical Engineering and Computer Science</w:t>
+      </w:r>
+    </w:p>
+    <w:p>
+      <w:pPr>
+        <w:autoSpaceDE w:val="0"/>
+        <w:autoSpaceDN w:val="0"/>
+        <w:adjustRightInd w:val="0"/>
+        <w:spacing w:after="0" w:line="240" w:lineRule="auto"/>
+        <w:rPr>
+          <w:rFonts w:ascii="Times New Roman" w:hAnsi="Times New Roman" w:cs="Times New Roman"/>
+          <w:sz w:val="24"/>
+          <w:szCs w:val="24"/>
+        </w:rPr>
+      </w:pPr>
+      <w:hyperlink r:id="rId17" w:history="1">
+        <w:r>
+          <w:rPr>
+            <w:rStyle w:val="Hyperlink"/>
+            <w:rFonts w:ascii="Times New Roman" w:hAnsi="Times New Roman" w:cs="Times New Roman"/>
+            <w:sz w:val="24"/>
+            <w:szCs w:val="24"/>
+          </w:rPr>
+          <w:t>emma.pierson@berkeley.edu</w:t>
+        </w:r>
+      </w:hyperlink>
+      <w:r>
+        <w:rPr>
+          <w:rFonts w:ascii="Times New Roman" w:hAnsi="Times New Roman" w:cs="Times New Roman"/>
+          <w:sz w:val="24"/>
+          <w:szCs w:val="24"/>
+        </w:rPr>
+        <w:t xml:space="preserve"> </w:t>
+      </w:r>
+    </w:p>
+    <w:p>
+      <w:pPr>
+        <w:autoSpaceDE w:val="0"/>
+        <w:autoSpaceDN w:val="0"/>
+        <w:adjustRightInd w:val="0"/>
+        <w:spacing w:after="0" w:line="240" w:lineRule="auto"/>
+        <w:rPr>
+          <w:rFonts w:ascii="Times New Roman" w:hAnsi="Times New Roman" w:cs="Times New Roman"/>
+          <w:sz w:val="24"/>
+          <w:szCs w:val="24"/>
+        </w:rPr>
+      </w:pPr>
+    </w:p>
+    <w:p>
+      <w:pPr>
+        <w:autoSpaceDE w:val="0"/>
+        <w:autoSpaceDN w:val="0"/>
+        <w:adjustRightInd w:val="0"/>
+        <w:spacing w:after="0" w:line="240" w:lineRule="auto"/>
+        <w:rPr>
+          <w:rFonts w:ascii="Times New Roman" w:hAnsi="Times New Roman" w:cs="Times New Roman"/>
+          <w:sz w:val="24"/>
+          <w:szCs w:val="24"/>
+        </w:rPr>
+      </w:pPr>
+    </w:p>
+    <w:p>
+      <w:pPr>
+        <w:autoSpaceDE w:val="0"/>
+        <w:autoSpaceDN w:val="0"/>
+        <w:adjustRightInd w:val="0"/>
+        <w:spacing w:after="0" w:line="240" w:lineRule="auto"/>
+        <w:rPr>
+          <w:rFonts w:ascii="Times New Roman" w:hAnsi="Times New Roman" w:cs="Times New Roman"/>
+          <w:sz w:val="24"/>
+          <w:szCs w:val="24"/>
+        </w:rPr>
+      </w:pPr>
     </w:p>
     <w:p>
       <w:pPr>
@@ -3962,12 +4816,7 @@
       </w:pPr>
     </w:p>
     <w:sectPr>
-      <w:headerReference w:type="even" r:id="rId17"/>
-      <w:headerReference w:type="default" r:id="rId18"/>
-      <w:footerReference w:type="even" r:id="rId19"/>
-      <w:footerReference w:type="default" r:id="rId20"/>
-      <w:headerReference w:type="first" r:id="rId21"/>
-      <w:footerReference w:type="first" r:id="rId22"/>
+      <w:footerReference w:type="default" r:id="rId18"/>
       <w:pgSz w:w="12240" w:h="15840"/>
       <w:pgMar w:top="1440" w:right="1440" w:bottom="1440" w:left="1440" w:header="720" w:footer="720" w:gutter="0"/>
       <w:cols w:space="720"/>
@@ -4007,16 +4856,6 @@
   <w:p>
     <w:pPr>
       <w:pStyle w:val="Footer"/>
-    </w:pPr>
-  </w:p>
-</w:ftr>
-</file>
-
-<file path=word/footer2.xml><?xml version="1.0" encoding="utf-8"?>
-<w:ftr xmlns:wpc="http://schemas.microsoft.com/office/word/2010/wordprocessingCanvas" xmlns:cx="http://schemas.microsoft.com/office/drawing/2014/chartex" xmlns:cx1="http://schemas.microsoft.com/office/drawing/2015/9/8/chartex" xmlns:cx2="http://schemas.microsoft.com/office/drawing/2015/10/21/chartex" xmlns:cx3="http://schemas.microsoft.com/office/drawing/2016/5/9/chartex" xmlns:cx4="http://schemas.microsoft.com/office/drawing/2016/5/10/chartex" xmlns:cx5="http://schemas.microsoft.com/office/drawing/2016/5/11/chartex" xmlns:cx6="http://schemas.microsoft.com/office/drawing/2016/5/12/chartex" xmlns:cx7="http://schemas.microsoft.com/office/drawing/2016/5/13/chartex" xmlns:cx8="http://schemas.microsoft.com/office/drawing/2016/5/14/chartex" xmlns:mc="http://schemas.openxmlformats.org/markup-compatibility/2006" xmlns:aink="http://schemas.microsoft.com/office/drawing/2016/ink" xmlns:am3d="http://schemas.microsoft.com/office/drawing/2017/model3d" xmlns:o="urn:schemas-microsoft-com:office:office" xmlns:oel="http://schemas.microsoft.com/office/2019/extlst" xmlns:r="http://schemas.openxmlformats.org/officeDocument/2006/relationships" xmlns:m="http://schemas.openxmlformats.org/officeDocument/2006/math" xmlns:v="urn:schemas-microsoft-com:vml" xmlns:wp14="http://schemas.microsoft.com/office/word/2010/wordprocessingDrawing" xmlns:wp="http://schemas.openxmlformats.org/drawingml/2006/wordprocessingDrawing" xmlns:w10="urn:schemas-microsoft-com:office:word" xmlns:w="http://schemas.openxmlformats.org/wordprocessingml/2006/main" xmlns:w14="http://schemas.microsoft.com/office/word/2010/wordml" xmlns:w15="http://schemas.microsoft.com/office/word/2012/wordml" xmlns:w16cex="http://schemas.microsoft.com/office/word/2018/wordml/cex" xmlns:w16cid="http://schemas.microsoft.com/office/word/2016/wordml/cid" xmlns:w16="http://schemas.microsoft.com/office/word/2018/wordml" xmlns:w16du="http://schemas.microsoft.com/office/word/2023/wordml/word16du" xmlns:w16sdtdh="http://schemas.microsoft.com/office/word/2020/wordml/sdtdatahash" xmlns:w16sdtfl="http://schemas.microsoft.com/office/word/2024/wordml/sdtformatlock" xmlns:w16se="http://schemas.microsoft.com/office/word/2015/wordml/symex" xmlns:wpg="http://schemas.microsoft.com/office/word/2010/wordprocessingGroup" xmlns:wpi="http://schemas.microsoft.com/office/word/2010/wordprocessingInk" xmlns:wne="http://schemas.microsoft.com/office/word/2006/wordml" xmlns:wps="http://schemas.microsoft.com/office/word/2010/wordprocessingShape" mc:Ignorable="w14 w15 w16se w16cid w16 w16cex w16sdtdh w16sdtfl w16du wp14">
-  <w:p>
-    <w:pPr>
-      <w:pStyle w:val="Footer"/>
       <w:jc w:val="right"/>
       <w:rPr>
         <w:rFonts w:ascii="Times New Roman" w:hAnsi="Times New Roman" w:cs="Times New Roman"/>
@@ -4038,42 +4877,26 @@
       <w:rPr>
         <w:rFonts w:ascii="Times New Roman" w:hAnsi="Times New Roman" w:cs="Times New Roman"/>
       </w:rPr>
-      <w:t>Decembe</w:t>
+      <w:t xml:space="preserve">April </w:t>
     </w:r>
     <w:r>
       <w:rPr>
         <w:rFonts w:ascii="Times New Roman" w:hAnsi="Times New Roman" w:cs="Times New Roman"/>
       </w:rPr>
-      <w:t>r</w:t>
+      <w:t>202</w:t>
     </w:r>
     <w:r>
       <w:rPr>
         <w:rFonts w:ascii="Times New Roman" w:hAnsi="Times New Roman" w:cs="Times New Roman"/>
       </w:rPr>
-      <w:t xml:space="preserve"> 202</w:t>
+      <w:t>6</w:t>
     </w:r>
     <w:r>
       <w:rPr>
         <w:rFonts w:ascii="Times New Roman" w:hAnsi="Times New Roman" w:cs="Times New Roman"/>
       </w:rPr>
-      <w:t>5</w:t>
-    </w:r>
-    <w:r>
-      <w:rPr>
-        <w:rFonts w:ascii="Times New Roman" w:hAnsi="Times New Roman" w:cs="Times New Roman"/>
-      </w:rPr>
       <w:t>)</w:t>
     </w:r>
-  </w:p>
-</w:ftr>
-</file>
-
-<file path=word/footer3.xml><?xml version="1.0" encoding="utf-8"?>
-<w:ftr xmlns:wpc="http://schemas.microsoft.com/office/word/2010/wordprocessingCanvas" xmlns:cx="http://schemas.microsoft.com/office/drawing/2014/chartex" xmlns:cx1="http://schemas.microsoft.com/office/drawing/2015/9/8/chartex" xmlns:cx2="http://schemas.microsoft.com/office/drawing/2015/10/21/chartex" xmlns:cx3="http://schemas.microsoft.com/office/drawing/2016/5/9/chartex" xmlns:cx4="http://schemas.microsoft.com/office/drawing/2016/5/10/chartex" xmlns:cx5="http://schemas.microsoft.com/office/drawing/2016/5/11/chartex" xmlns:cx6="http://schemas.microsoft.com/office/drawing/2016/5/12/chartex" xmlns:cx7="http://schemas.microsoft.com/office/drawing/2016/5/13/chartex" xmlns:cx8="http://schemas.microsoft.com/office/drawing/2016/5/14/chartex" xmlns:mc="http://schemas.openxmlformats.org/markup-compatibility/2006" xmlns:aink="http://schemas.microsoft.com/office/drawing/2016/ink" xmlns:am3d="http://schemas.microsoft.com/office/drawing/2017/model3d" xmlns:o="urn:schemas-microsoft-com:office:office" xmlns:oel="http://schemas.microsoft.com/office/2019/extlst" xmlns:r="http://schemas.openxmlformats.org/officeDocument/2006/relationships" xmlns:m="http://schemas.openxmlformats.org/officeDocument/2006/math" xmlns:v="urn:schemas-microsoft-com:vml" xmlns:wp14="http://schemas.microsoft.com/office/word/2010/wordprocessingDrawing" xmlns:wp="http://schemas.openxmlformats.org/drawingml/2006/wordprocessingDrawing" xmlns:w10="urn:schemas-microsoft-com:office:word" xmlns:w="http://schemas.openxmlformats.org/wordprocessingml/2006/main" xmlns:w14="http://schemas.microsoft.com/office/word/2010/wordml" xmlns:w15="http://schemas.microsoft.com/office/word/2012/wordml" xmlns:w16cex="http://schemas.microsoft.com/office/word/2018/wordml/cex" xmlns:w16cid="http://schemas.microsoft.com/office/word/2016/wordml/cid" xmlns:w16="http://schemas.microsoft.com/office/word/2018/wordml" xmlns:w16du="http://schemas.microsoft.com/office/word/2023/wordml/word16du" xmlns:w16sdtdh="http://schemas.microsoft.com/office/word/2020/wordml/sdtdatahash" xmlns:w16sdtfl="http://schemas.microsoft.com/office/word/2024/wordml/sdtformatlock" xmlns:w16se="http://schemas.microsoft.com/office/word/2015/wordml/symex" xmlns:wpg="http://schemas.microsoft.com/office/word/2010/wordprocessingGroup" xmlns:wpi="http://schemas.microsoft.com/office/word/2010/wordprocessingInk" xmlns:wne="http://schemas.microsoft.com/office/word/2006/wordml" xmlns:wps="http://schemas.microsoft.com/office/word/2010/wordprocessingShape" mc:Ignorable="w14 w15 w16se w16cid w16 w16cex w16sdtdh w16sdtfl w16du wp14">
-  <w:p>
-    <w:pPr>
-      <w:pStyle w:val="Footer"/>
-    </w:pPr>
   </w:p>
 </w:ftr>
 </file>
@@ -4101,36 +4924,6 @@
     </w:p>
   </w:footnote>
 </w:footnotes>
-</file>
-
-<file path=word/header1.xml><?xml version="1.0" encoding="utf-8"?>
-<w:hdr xmlns:wpc="http://schemas.microsoft.com/office/word/2010/wordprocessingCanvas" xmlns:cx="http://schemas.microsoft.com/office/drawing/2014/chartex" xmlns:cx1="http://schemas.microsoft.com/office/drawing/2015/9/8/chartex" xmlns:cx2="http://schemas.microsoft.com/office/drawing/2015/10/21/chartex" xmlns:cx3="http://schemas.microsoft.com/office/drawing/2016/5/9/chartex" xmlns:cx4="http://schemas.microsoft.com/office/drawing/2016/5/10/chartex" xmlns:cx5="http://schemas.microsoft.com/office/drawing/2016/5/11/chartex" xmlns:cx6="http://schemas.microsoft.com/office/drawing/2016/5/12/chartex" xmlns:cx7="http://schemas.microsoft.com/office/drawing/2016/5/13/chartex" xmlns:cx8="http://schemas.microsoft.com/office/drawing/2016/5/14/chartex" xmlns:mc="http://schemas.openxmlformats.org/markup-compatibility/2006" xmlns:aink="http://schemas.microsoft.com/office/drawing/2016/ink" xmlns:am3d="http://schemas.microsoft.com/office/drawing/2017/model3d" xmlns:o="urn:schemas-microsoft-com:office:office" xmlns:oel="http://schemas.microsoft.com/office/2019/extlst" xmlns:r="http://schemas.openxmlformats.org/officeDocument/2006/relationships" xmlns:m="http://schemas.openxmlformats.org/officeDocument/2006/math" xmlns:v="urn:schemas-microsoft-com:vml" xmlns:wp14="http://schemas.microsoft.com/office/word/2010/wordprocessingDrawing" xmlns:wp="http://schemas.openxmlformats.org/drawingml/2006/wordprocessingDrawing" xmlns:w10="urn:schemas-microsoft-com:office:word" xmlns:w="http://schemas.openxmlformats.org/wordprocessingml/2006/main" xmlns:w14="http://schemas.microsoft.com/office/word/2010/wordml" xmlns:w15="http://schemas.microsoft.com/office/word/2012/wordml" xmlns:w16cex="http://schemas.microsoft.com/office/word/2018/wordml/cex" xmlns:w16cid="http://schemas.microsoft.com/office/word/2016/wordml/cid" xmlns:w16="http://schemas.microsoft.com/office/word/2018/wordml" xmlns:w16du="http://schemas.microsoft.com/office/word/2023/wordml/word16du" xmlns:w16sdtdh="http://schemas.microsoft.com/office/word/2020/wordml/sdtdatahash" xmlns:w16sdtfl="http://schemas.microsoft.com/office/word/2024/wordml/sdtformatlock" xmlns:w16se="http://schemas.microsoft.com/office/word/2015/wordml/symex" xmlns:wpg="http://schemas.microsoft.com/office/word/2010/wordprocessingGroup" xmlns:wpi="http://schemas.microsoft.com/office/word/2010/wordprocessingInk" xmlns:wne="http://schemas.microsoft.com/office/word/2006/wordml" xmlns:wps="http://schemas.microsoft.com/office/word/2010/wordprocessingShape" mc:Ignorable="w14 w15 w16se w16cid w16 w16cex w16sdtdh w16sdtfl w16du wp14">
-  <w:p>
-    <w:pPr>
-      <w:pStyle w:val="Header"/>
-    </w:pPr>
-  </w:p>
-</w:hdr>
-</file>
-
-<file path=word/header2.xml><?xml version="1.0" encoding="utf-8"?>
-<w:hdr xmlns:wpc="http://schemas.microsoft.com/office/word/2010/wordprocessingCanvas" xmlns:cx="http://schemas.microsoft.com/office/drawing/2014/chartex" xmlns:cx1="http://schemas.microsoft.com/office/drawing/2015/9/8/chartex" xmlns:cx2="http://schemas.microsoft.com/office/drawing/2015/10/21/chartex" xmlns:cx3="http://schemas.microsoft.com/office/drawing/2016/5/9/chartex" xmlns:cx4="http://schemas.microsoft.com/office/drawing/2016/5/10/chartex" xmlns:cx5="http://schemas.microsoft.com/office/drawing/2016/5/11/chartex" xmlns:cx6="http://schemas.microsoft.com/office/drawing/2016/5/12/chartex" xmlns:cx7="http://schemas.microsoft.com/office/drawing/2016/5/13/chartex" xmlns:cx8="http://schemas.microsoft.com/office/drawing/2016/5/14/chartex" xmlns:mc="http://schemas.openxmlformats.org/markup-compatibility/2006" xmlns:aink="http://schemas.microsoft.com/office/drawing/2016/ink" xmlns:am3d="http://schemas.microsoft.com/office/drawing/2017/model3d" xmlns:o="urn:schemas-microsoft-com:office:office" xmlns:oel="http://schemas.microsoft.com/office/2019/extlst" xmlns:r="http://schemas.openxmlformats.org/officeDocument/2006/relationships" xmlns:m="http://schemas.openxmlformats.org/officeDocument/2006/math" xmlns:v="urn:schemas-microsoft-com:vml" xmlns:wp14="http://schemas.microsoft.com/office/word/2010/wordprocessingDrawing" xmlns:wp="http://schemas.openxmlformats.org/drawingml/2006/wordprocessingDrawing" xmlns:w10="urn:schemas-microsoft-com:office:word" xmlns:w="http://schemas.openxmlformats.org/wordprocessingml/2006/main" xmlns:w14="http://schemas.microsoft.com/office/word/2010/wordml" xmlns:w15="http://schemas.microsoft.com/office/word/2012/wordml" xmlns:w16cex="http://schemas.microsoft.com/office/word/2018/wordml/cex" xmlns:w16cid="http://schemas.microsoft.com/office/word/2016/wordml/cid" xmlns:w16="http://schemas.microsoft.com/office/word/2018/wordml" xmlns:w16du="http://schemas.microsoft.com/office/word/2023/wordml/word16du" xmlns:w16sdtdh="http://schemas.microsoft.com/office/word/2020/wordml/sdtdatahash" xmlns:w16sdtfl="http://schemas.microsoft.com/office/word/2024/wordml/sdtformatlock" xmlns:w16se="http://schemas.microsoft.com/office/word/2015/wordml/symex" xmlns:wpg="http://schemas.microsoft.com/office/word/2010/wordprocessingGroup" xmlns:wpi="http://schemas.microsoft.com/office/word/2010/wordprocessingInk" xmlns:wne="http://schemas.microsoft.com/office/word/2006/wordml" xmlns:wps="http://schemas.microsoft.com/office/word/2010/wordprocessingShape" mc:Ignorable="w14 w15 w16se w16cid w16 w16cex w16sdtdh w16sdtfl w16du wp14">
-  <w:p>
-    <w:pPr>
-      <w:pStyle w:val="Header"/>
-    </w:pPr>
-  </w:p>
-</w:hdr>
-</file>
-
-<file path=word/header3.xml><?xml version="1.0" encoding="utf-8"?>
-<w:hdr xmlns:wpc="http://schemas.microsoft.com/office/word/2010/wordprocessingCanvas" xmlns:cx="http://schemas.microsoft.com/office/drawing/2014/chartex" xmlns:cx1="http://schemas.microsoft.com/office/drawing/2015/9/8/chartex" xmlns:cx2="http://schemas.microsoft.com/office/drawing/2015/10/21/chartex" xmlns:cx3="http://schemas.microsoft.com/office/drawing/2016/5/9/chartex" xmlns:cx4="http://schemas.microsoft.com/office/drawing/2016/5/10/chartex" xmlns:cx5="http://schemas.microsoft.com/office/drawing/2016/5/11/chartex" xmlns:cx6="http://schemas.microsoft.com/office/drawing/2016/5/12/chartex" xmlns:cx7="http://schemas.microsoft.com/office/drawing/2016/5/13/chartex" xmlns:cx8="http://schemas.microsoft.com/office/drawing/2016/5/14/chartex" xmlns:mc="http://schemas.openxmlformats.org/markup-compatibility/2006" xmlns:aink="http://schemas.microsoft.com/office/drawing/2016/ink" xmlns:am3d="http://schemas.microsoft.com/office/drawing/2017/model3d" xmlns:o="urn:schemas-microsoft-com:office:office" xmlns:oel="http://schemas.microsoft.com/office/2019/extlst" xmlns:r="http://schemas.openxmlformats.org/officeDocument/2006/relationships" xmlns:m="http://schemas.openxmlformats.org/officeDocument/2006/math" xmlns:v="urn:schemas-microsoft-com:vml" xmlns:wp14="http://schemas.microsoft.com/office/word/2010/wordprocessingDrawing" xmlns:wp="http://schemas.openxmlformats.org/drawingml/2006/wordprocessingDrawing" xmlns:w10="urn:schemas-microsoft-com:office:word" xmlns:w="http://schemas.openxmlformats.org/wordprocessingml/2006/main" xmlns:w14="http://schemas.microsoft.com/office/word/2010/wordml" xmlns:w15="http://schemas.microsoft.com/office/word/2012/wordml" xmlns:w16cex="http://schemas.microsoft.com/office/word/2018/wordml/cex" xmlns:w16cid="http://schemas.microsoft.com/office/word/2016/wordml/cid" xmlns:w16="http://schemas.microsoft.com/office/word/2018/wordml" xmlns:w16du="http://schemas.microsoft.com/office/word/2023/wordml/word16du" xmlns:w16sdtdh="http://schemas.microsoft.com/office/word/2020/wordml/sdtdatahash" xmlns:w16sdtfl="http://schemas.microsoft.com/office/word/2024/wordml/sdtformatlock" xmlns:w16se="http://schemas.microsoft.com/office/word/2015/wordml/symex" xmlns:wpg="http://schemas.microsoft.com/office/word/2010/wordprocessingGroup" xmlns:wpi="http://schemas.microsoft.com/office/word/2010/wordprocessingInk" xmlns:wne="http://schemas.microsoft.com/office/word/2006/wordml" xmlns:wps="http://schemas.microsoft.com/office/word/2010/wordprocessingShape" mc:Ignorable="w14 w15 w16se w16cid w16 w16cex w16sdtdh w16sdtfl w16du wp14">
-  <w:p>
-    <w:pPr>
-      <w:pStyle w:val="Header"/>
-    </w:pPr>
-  </w:p>
-</w:hdr>
 </file>
 
 <file path=word/numbering.xml><?xml version="1.0" encoding="utf-8"?>
@@ -4703,7 +5496,7 @@
   <w:abstractNum w:abstractNumId="5" w15:restartNumberingAfterBreak="0">
     <w:nsid w:val="5A6A5DD2"/>
     <w:multiLevelType w:val="hybridMultilevel"/>
-    <w:tmpl w:val="B0D68F8A"/>
+    <w:tmpl w:val="F708951C"/>
     <w:lvl w:ilvl="0" w:tplc="04090001">
       <w:start w:val="1"/>
       <w:numFmt w:val="bullet"/>
@@ -4927,6 +5720,119 @@
     </w:lvl>
   </w:abstractNum>
   <w:abstractNum w:abstractNumId="7" w15:restartNumberingAfterBreak="0">
+    <w:nsid w:val="6AE06A6C"/>
+    <w:multiLevelType w:val="hybridMultilevel"/>
+    <w:tmpl w:val="07DCF634"/>
+    <w:lvl w:ilvl="0" w:tplc="04090001">
+      <w:start w:val="1"/>
+      <w:numFmt w:val="bullet"/>
+      <w:lvlText w:val=""/>
+      <w:lvlJc w:val="left"/>
+      <w:pPr>
+        <w:ind w:left="720" w:hanging="360"/>
+      </w:pPr>
+      <w:rPr>
+        <w:rFonts w:ascii="Symbol" w:hAnsi="Symbol" w:hint="default"/>
+      </w:rPr>
+    </w:lvl>
+    <w:lvl w:ilvl="1" w:tplc="04090003" w:tentative="1">
+      <w:start w:val="1"/>
+      <w:numFmt w:val="bullet"/>
+      <w:lvlText w:val="o"/>
+      <w:lvlJc w:val="left"/>
+      <w:pPr>
+        <w:ind w:left="1440" w:hanging="360"/>
+      </w:pPr>
+      <w:rPr>
+        <w:rFonts w:ascii="Courier New" w:hAnsi="Courier New" w:cs="Courier New" w:hint="default"/>
+      </w:rPr>
+    </w:lvl>
+    <w:lvl w:ilvl="2" w:tplc="04090005" w:tentative="1">
+      <w:start w:val="1"/>
+      <w:numFmt w:val="bullet"/>
+      <w:lvlText w:val=""/>
+      <w:lvlJc w:val="left"/>
+      <w:pPr>
+        <w:ind w:left="2160" w:hanging="360"/>
+      </w:pPr>
+      <w:rPr>
+        <w:rFonts w:ascii="Wingdings" w:hAnsi="Wingdings" w:hint="default"/>
+      </w:rPr>
+    </w:lvl>
+    <w:lvl w:ilvl="3" w:tplc="04090001" w:tentative="1">
+      <w:start w:val="1"/>
+      <w:numFmt w:val="bullet"/>
+      <w:lvlText w:val=""/>
+      <w:lvlJc w:val="left"/>
+      <w:pPr>
+        <w:ind w:left="2880" w:hanging="360"/>
+      </w:pPr>
+      <w:rPr>
+        <w:rFonts w:ascii="Symbol" w:hAnsi="Symbol" w:hint="default"/>
+      </w:rPr>
+    </w:lvl>
+    <w:lvl w:ilvl="4" w:tplc="04090003" w:tentative="1">
+      <w:start w:val="1"/>
+      <w:numFmt w:val="bullet"/>
+      <w:lvlText w:val="o"/>
+      <w:lvlJc w:val="left"/>
+      <w:pPr>
+        <w:ind w:left="3600" w:hanging="360"/>
+      </w:pPr>
+      <w:rPr>
+        <w:rFonts w:ascii="Courier New" w:hAnsi="Courier New" w:cs="Courier New" w:hint="default"/>
+      </w:rPr>
+    </w:lvl>
+    <w:lvl w:ilvl="5" w:tplc="04090005" w:tentative="1">
+      <w:start w:val="1"/>
+      <w:numFmt w:val="bullet"/>
+      <w:lvlText w:val=""/>
+      <w:lvlJc w:val="left"/>
+      <w:pPr>
+        <w:ind w:left="4320" w:hanging="360"/>
+      </w:pPr>
+      <w:rPr>
+        <w:rFonts w:ascii="Wingdings" w:hAnsi="Wingdings" w:hint="default"/>
+      </w:rPr>
+    </w:lvl>
+    <w:lvl w:ilvl="6" w:tplc="04090001" w:tentative="1">
+      <w:start w:val="1"/>
+      <w:numFmt w:val="bullet"/>
+      <w:lvlText w:val=""/>
+      <w:lvlJc w:val="left"/>
+      <w:pPr>
+        <w:ind w:left="5040" w:hanging="360"/>
+      </w:pPr>
+      <w:rPr>
+        <w:rFonts w:ascii="Symbol" w:hAnsi="Symbol" w:hint="default"/>
+      </w:rPr>
+    </w:lvl>
+    <w:lvl w:ilvl="7" w:tplc="04090003" w:tentative="1">
+      <w:start w:val="1"/>
+      <w:numFmt w:val="bullet"/>
+      <w:lvlText w:val="o"/>
+      <w:lvlJc w:val="left"/>
+      <w:pPr>
+        <w:ind w:left="5760" w:hanging="360"/>
+      </w:pPr>
+      <w:rPr>
+        <w:rFonts w:ascii="Courier New" w:hAnsi="Courier New" w:cs="Courier New" w:hint="default"/>
+      </w:rPr>
+    </w:lvl>
+    <w:lvl w:ilvl="8" w:tplc="04090005" w:tentative="1">
+      <w:start w:val="1"/>
+      <w:numFmt w:val="bullet"/>
+      <w:lvlText w:val=""/>
+      <w:lvlJc w:val="left"/>
+      <w:pPr>
+        <w:ind w:left="6480" w:hanging="360"/>
+      </w:pPr>
+      <w:rPr>
+        <w:rFonts w:ascii="Wingdings" w:hAnsi="Wingdings" w:hint="default"/>
+      </w:rPr>
+    </w:lvl>
+  </w:abstractNum>
+  <w:abstractNum w:abstractNumId="8" w15:restartNumberingAfterBreak="0">
     <w:nsid w:val="6EF8748C"/>
     <w:multiLevelType w:val="hybridMultilevel"/>
     <w:tmpl w:val="F138B0D6"/>
@@ -5039,7 +5945,7 @@
       </w:rPr>
     </w:lvl>
   </w:abstractNum>
-  <w:abstractNum w:abstractNumId="8" w15:restartNumberingAfterBreak="0">
+  <w:abstractNum w:abstractNumId="9" w15:restartNumberingAfterBreak="0">
     <w:nsid w:val="79587802"/>
     <w:multiLevelType w:val="hybridMultilevel"/>
     <w:tmpl w:val="7430C8CC"/>
@@ -5152,7 +6058,7 @@
       </w:rPr>
     </w:lvl>
   </w:abstractNum>
-  <w:abstractNum w:abstractNumId="9" w15:restartNumberingAfterBreak="0">
+  <w:abstractNum w:abstractNumId="10" w15:restartNumberingAfterBreak="0">
     <w:nsid w:val="7C5A61C2"/>
     <w:multiLevelType w:val="hybridMultilevel"/>
     <w:tmpl w:val="29DE708C"/>
@@ -5281,19 +6187,22 @@
     <w:abstractNumId w:val="3"/>
   </w:num>
   <w:num w:numId="6" w16cid:durableId="1067875030">
-    <w:abstractNumId w:val="8"/>
+    <w:abstractNumId w:val="9"/>
   </w:num>
   <w:num w:numId="7" w16cid:durableId="1115979560">
-    <w:abstractNumId w:val="9"/>
+    <w:abstractNumId w:val="10"/>
   </w:num>
   <w:num w:numId="8" w16cid:durableId="2001494621">
     <w:abstractNumId w:val="5"/>
   </w:num>
   <w:num w:numId="9" w16cid:durableId="983238221">
-    <w:abstractNumId w:val="7"/>
+    <w:abstractNumId w:val="8"/>
   </w:num>
   <w:num w:numId="10" w16cid:durableId="1048991147">
     <w:abstractNumId w:val="4"/>
+  </w:num>
+  <w:num w:numId="11" w16cid:durableId="1318921394">
+    <w:abstractNumId w:val="7"/>
   </w:num>
 </w:numbering>
 </file>

</xml_diff>